<commit_message>
docs(AnC): laporan fase 20 revisi 2 — detail penuh, tanpa klaim data cuaca, angka dihitung ulang dari CSV
</commit_message>
<xml_diff>
--- a/03_Catatan/Laporan_Fase20_Ensemble_LGBM_Theta.docx
+++ b/03_Catatan/Laporan_Fase20_Ensemble_LGBM_Theta.docx
@@ -3,16 +3,13 @@
 <w:document xmlns:wpc="http://schemas.microsoft.com/office/word/2010/wordprocessingCanvas" xmlns:mo="http://schemas.microsoft.com/office/mac/office/2008/main" xmlns:mc="http://schemas.openxmlformats.org/markup-compatibility/2006" xmlns:mv="urn:schemas-microsoft-com:mac:vml" xmlns:o="urn:schemas-microsoft-com:office:office" xmlns:r="http://schemas.openxmlformats.org/officeDocument/2006/relationships" xmlns:m="http://schemas.openxmlformats.org/officeDocument/2006/math" xmlns:v="urn:schemas-microsoft-com:vml" xmlns:wp14="http://schemas.microsoft.com/office/word/2010/wordprocessingDrawing" xmlns:wp="http://schemas.openxmlformats.org/drawingml/2006/wordprocessingDrawing" xmlns:w10="urn:schemas-microsoft-com:office:word" xmlns:w="http://schemas.openxmlformats.org/wordprocessingml/2006/main" xmlns:w14="http://schemas.microsoft.com/office/word/2010/wordml" xmlns:wpg="http://schemas.microsoft.com/office/word/2010/wordprocessingGroup" xmlns:wpi="http://schemas.microsoft.com/office/word/2010/wordprocessingInk" xmlns:wne="http://schemas.microsoft.com/office/word/2006/wordml" xmlns:wps="http://schemas.microsoft.com/office/word/2010/wordprocessingShape" mc:Ignorable="w14 wp14">
   <w:body>
     <w:p>
-      <w:pPr>
-        <w:jc w:val="left"/>
-      </w:pPr>
       <w:r>
         <w:rPr>
           <w:b/>
           <w:color w:val="0F172A"/>
-          <w:sz w:val="36"/>
+          <w:sz w:val="34"/>
         </w:rPr>
-        <w:t>LAPORAN HASIL EKSPERIMEN — FASE 20</w:t>
+        <w:t>LAPORAN HASIL EKSPERIMEN — FASE 20 (Revisi 2)</w:t>
       </w:r>
     </w:p>
     <w:p>
@@ -22,7 +19,7 @@
           <w:color w:val="06B6D4"/>
           <w:sz w:val="24"/>
         </w:rPr>
-        <w:t>Pergantian Metode Paper Necula (2025): Ensemble LGBM + Theta</w:t>
+        <w:t>Penggantian Penuh Metode Paper Necula (2025) oleh Ensemble LGBM + Theta</w:t>
       </w:r>
     </w:p>
     <w:p>
@@ -31,9 +28,9 @@
           <w:color w:val="475569"/>
           <w:sz w:val="19"/>
         </w:rPr>
-        <w:t>Mata kuliah Algorithms &amp; Complexity — proyek peramalan kualitas udara (NO2, PM10, PM2.5; data Rumania)</w:t>
+        <w:t>Mata kuliah Algorithms &amp; Complexity — proyek peramalan kualitas udara (NO2, PM10, PM2.5; data Rumania 2019–2023)</w:t>
         <w:br/>
-        <w:t>Madajabbar Palapa Hakim — 16 Oktober 2026</w:t>
+        <w:t>Madajabbar Palapa Hakim — 16 Oktober 2026 — semua angka dihitung ulang dari berkas hasil yang dibekukan (results/)</w:t>
       </w:r>
     </w:p>
     <w:p>
@@ -44,9 +41,14 @@
         <w:rPr>
           <w:b/>
           <w:color w:val="0F172A"/>
-          <w:sz w:val="30"/>
+          <w:sz w:val="28"/>
         </w:rPr>
         <w:t>1. Ringkasan</w:t>
+      </w:r>
+    </w:p>
+    <w:p>
+      <w:r>
+        <w:t>Ensemble LGBM + Theta dikunci sebagai satu-satunya metode yang ditulis di naskah, menggantikan SARIMA + BiLSTM milik paper Necula (2025) secara penuh. Kunci angkanya:</w:t>
       </w:r>
     </w:p>
     <w:p>
@@ -59,18 +61,13 @@
           <w:b/>
           <w:sz w:val="21"/>
         </w:rPr>
-        <w:t xml:space="preserve">Ensemble LGBM + Theta: </w:t>
+        <w:t xml:space="preserve">Keunggulan agregat: </w:t>
       </w:r>
       <w:r>
         <w:rPr>
           <w:sz w:val="21"/>
         </w:rPr>
-        <w:t xml:space="preserve">metode yang disarankan (dan pada laporan ini saya kunci) adalah </w:t>
-      </w:r>
-    </w:p>
-    <w:p>
-      <w:r>
-        <w:t>rata-rata dari dua model peramalan LGBM (pembaca pola dari data) dan Theta (penaksir garis tren). Metode ini menjadi satu-satunya yang ditulis di naskah sebagai pengganti SARIMA + BiLSTM milik paper Necula.</w:t>
+        <w:t>−5,5% — skor agregat (rata-rata 9 sel uji) lawan metode lengkap paper; negatif berarti lebih baik.</w:t>
       </w:r>
     </w:p>
     <w:p>
@@ -89,7 +86,7 @@
         <w:rPr>
           <w:sz w:val="21"/>
         </w:rPr>
-        <w:t>7 dari 9 sel uji (komposisi polutan × jarak peramalan) diraih, dan tidak ada satu sel pun kekalahan yang signifikan secara statistik menurut uji Diebold–Mariano.</w:t>
+        <w:t>7 dari 9 sel dimenangkan, 5 di antaranya nyata secara statistik (p&lt;0,05, uji Diebold–Mariano); sedangkan kekalahan nyata 0 dari 9 — dua sel NO2 jarak dekat kalah tipis dan tidak nyata.</w:t>
       </w:r>
     </w:p>
     <w:p>
@@ -102,13 +99,13 @@
           <w:b/>
           <w:sz w:val="21"/>
         </w:rPr>
-        <w:t xml:space="preserve">Skor agregat: </w:t>
+        <w:t xml:space="preserve">Keunggulan terbesar: </w:t>
       </w:r>
       <w:r>
         <w:rPr>
           <w:sz w:val="21"/>
         </w:rPr>
-        <w:t>5,46% lebih baik daripada gabungan metode lengkap paper; keunggulan terbesar pada PM2.5 jarak 30 hari, 20,1% lebih baik.</w:t>
+        <w:t>PM2.5 pada jarak 30 hari, lebih baik 20,1%.</w:t>
       </w:r>
     </w:p>
     <w:p>
@@ -121,13 +118,32 @@
           <w:b/>
           <w:sz w:val="21"/>
         </w:rPr>
-        <w:t xml:space="preserve">Sifat: </w:t>
+        <w:t xml:space="preserve">Sifat metode: </w:t>
       </w:r>
       <w:r>
         <w:rPr>
           <w:sz w:val="21"/>
         </w:rPr>
-        <w:t>tanpa SARIMA dan tanpa jaringan saraf: lebih sederhana, dilatih penuh di CPU laptop, mudah direproduksi, dan tidak membawa komponen yang dilarang arahan.</w:t>
+        <w:t>tanpa SARIMA, tanpa jaringan saraf, tanpa data tambahan apa pun — hanya riwayat nilai polutan itu sendiri plus penanda kalender (hari, posisi musiman). Tidak ada variabel eksternal.</w:t>
+      </w:r>
+    </w:p>
+    <w:p>
+      <w:pPr>
+        <w:pStyle w:val="ListBullet"/>
+        <w:spacing w:after="60"/>
+      </w:pPr>
+      <w:r>
+        <w:rPr>
+          <w:b/>
+          <w:sz w:val="21"/>
+        </w:rPr>
+        <w:t xml:space="preserve">Biaya: </w:t>
+      </w:r>
+      <w:r>
+        <w:rPr>
+          <w:sz w:val="21"/>
+        </w:rPr>
+        <w:t>seluruh eksperimen berjalan di CPU laptop; metode paper membutuhkan GPU (BiLSTM 544.513 parameter, 247 detik per lipatan di T4, belum termasuk percobaan-tuning).</w:t>
       </w:r>
     </w:p>
     <w:p>
@@ -138,19 +154,19 @@
         <w:rPr>
           <w:b/>
           <w:color w:val="0F172A"/>
-          <w:sz w:val="30"/>
+          <w:sz w:val="28"/>
         </w:rPr>
         <w:t>2. Latar Belakang dan Arah Pekerjaan</w:t>
       </w:r>
     </w:p>
     <w:p>
       <w:r>
-        <w:t>Paper Necula (2025) meramal polusi udara dengan dua lapis: SARIMA musiman 12 hari, lalu sisa kesalahannya dibenahi oleh jaringan saraf BiLSTM. Kesepakatan kerja yang berlaku: kedua komponen itu seluruhnya diganti — dan naskah hanya menulis satu metode terbaik hasil pembuktian eksperimen yang adil.</w:t>
+        <w:t>Paper Necula dkk. (2025, Electronics 14(3):549) meramal polusi udara dengan dua lapis: SARIMA musiman periode 12 hari, lalu sisa (residu) kesalahannya dibenahi jaringan saraf BiLSTM. Proyek mata kuliah ini adalah replikasi dengan pemindahan (replication-with-swap): paper dijalankan ulang serupa, lalu metodenya diganti. Kesepakatan kerja final: kedua komponen paper (SARIMA dan BiLSTM) diganti seluruhnya, dan naskah hanya menulis satu metode pengganti terbaik yang dibuktikan lewat eksperimen adil.</w:t>
       </w:r>
     </w:p>
     <w:p>
       <w:r>
-        <w:t>Kandidat 'router' (pemilih model terbaik per kondisi data) sudah diperiksa lebih dulu dan sengaja ditiadakan: router hanya aturan memilih, bukan metode meramal, dan akan menyulitkan penelaah. Hasilnya dipertahankan sebagai bahan analisis serta daftar karya lanjutan.</w:t>
+        <w:t>Kandidat 'router' (aturan pemilih model terbaik per kondisi data) telah diperiksa lebih awal dan sengaja ditiadakan dari daftar pengganti: router bukan metode meramal — ia hanya memilih di antara metode — sehingga kehadirannya justru menyulitkan penceritaan bagi penelaah. Hasil router tetap dilaporkan sebagai bahan analisis dan kerja lanjutan.</w:t>
       </w:r>
     </w:p>
     <w:p>
@@ -161,74 +177,246 @@
         <w:rPr>
           <w:b/>
           <w:color w:val="0F172A"/>
-          <w:sz w:val="30"/>
+          <w:sz w:val="28"/>
         </w:rPr>
-        <w:t>3. Cara Menguji Secara Adil (Protokol)</w:t>
+        <w:t>3. Data</w:t>
       </w:r>
+    </w:p>
+    <w:tbl>
+      <w:tblPr>
+        <w:tblW w:type="auto" w:w="0"/>
+        <w:jc w:val="center"/>
+        <w:tblLook w:firstColumn="1" w:firstRow="1" w:lastColumn="0" w:lastRow="0" w:noHBand="0" w:noVBand="1" w:val="04A0"/>
+        <w:tblBorders>
+          <w:top w:val="single" w:sz="4" w:space="0" w:color="CBD5E0"/>
+          <w:bottom w:val="single" w:sz="4" w:space="0" w:color="CBD5E0"/>
+          <w:insideH w:val="single" w:sz="4" w:space="0" w:color="CBD5E0"/>
+          <w:insideV w:val="none"/>
+          <w:left w:val="none"/>
+          <w:right w:val="none"/>
+        </w:tblBorders>
+      </w:tblPr>
+      <w:tblGrid>
+        <w:gridCol w:w="4819"/>
+        <w:gridCol w:w="4819"/>
+      </w:tblGrid>
+      <w:tr>
+        <w:tc>
+          <w:tcPr>
+            <w:tcW w:type="dxa" w:w="2041"/>
+            <w:shd w:fill="0F172A"/>
+          </w:tcPr>
+          <w:p>
+            <w:r>
+              <w:rPr>
+                <w:b/>
+                <w:color w:val="FFFFFF"/>
+                <w:sz w:val="18"/>
+              </w:rPr>
+              <w:t>Aspek</w:t>
+            </w:r>
+          </w:p>
+        </w:tc>
+        <w:tc>
+          <w:tcPr>
+            <w:tcW w:type="dxa" w:w="7483"/>
+            <w:shd w:fill="0F172A"/>
+          </w:tcPr>
+          <w:p>
+            <w:r>
+              <w:rPr>
+                <w:b/>
+                <w:color w:val="FFFFFF"/>
+                <w:sz w:val="18"/>
+              </w:rPr>
+              <w:t>Keterangan</w:t>
+            </w:r>
+          </w:p>
+        </w:tc>
+      </w:tr>
+      <w:tr>
+        <w:tc>
+          <w:tcPr>
+            <w:tcW w:type="dxa" w:w="2041"/>
+          </w:tcPr>
+          <w:p>
+            <w:r>
+              <w:rPr>
+                <w:sz w:val="18"/>
+              </w:rPr>
+              <w:t>Sumber</w:t>
+            </w:r>
+          </w:p>
+        </w:tc>
+        <w:tc>
+          <w:tcPr>
+            <w:tcW w:type="dxa" w:w="7483"/>
+          </w:tcPr>
+          <w:p>
+            <w:r>
+              <w:rPr>
+                <w:sz w:val="18"/>
+              </w:rPr>
+              <w:t>Dataset pendamping paper Necula (repo Code4PollutantsBiLSTM); salinan di data/transformed_data.csv</w:t>
+            </w:r>
+          </w:p>
+        </w:tc>
+      </w:tr>
+      <w:tr>
+        <w:tc>
+          <w:tcPr>
+            <w:tcW w:type="dxa" w:w="2041"/>
+            <w:shd w:fill="F3F4F6"/>
+          </w:tcPr>
+          <w:p>
+            <w:r>
+              <w:rPr>
+                <w:sz w:val="18"/>
+              </w:rPr>
+              <w:t>Ruang lingkup</w:t>
+            </w:r>
+          </w:p>
+        </w:tc>
+        <w:tc>
+          <w:tcPr>
+            <w:tcW w:type="dxa" w:w="7483"/>
+            <w:shd w:fill="F3F4F6"/>
+          </w:tcPr>
+          <w:p>
+            <w:r>
+              <w:rPr>
+                <w:sz w:val="18"/>
+              </w:rPr>
+              <w:t>1 kota di Rumania, 3 polutan: NO2, PM10, PM2.5 (kolom PM25)</w:t>
+            </w:r>
+          </w:p>
+        </w:tc>
+      </w:tr>
+      <w:tr>
+        <w:tc>
+          <w:tcPr>
+            <w:tcW w:type="dxa" w:w="2041"/>
+          </w:tcPr>
+          <w:p>
+            <w:r>
+              <w:rPr>
+                <w:sz w:val="18"/>
+              </w:rPr>
+              <w:t>Rentang</w:t>
+            </w:r>
+          </w:p>
+        </w:tc>
+        <w:tc>
+          <w:tcPr>
+            <w:tcW w:type="dxa" w:w="7483"/>
+          </w:tcPr>
+          <w:p>
+            <w:r>
+              <w:rPr>
+                <w:sz w:val="18"/>
+              </w:rPr>
+              <w:t>1 Januari 2019 – 31 Desember 2023 (1.826 hari, harian)</w:t>
+            </w:r>
+          </w:p>
+        </w:tc>
+      </w:tr>
+      <w:tr>
+        <w:tc>
+          <w:tcPr>
+            <w:tcW w:type="dxa" w:w="2041"/>
+            <w:shd w:fill="F3F4F6"/>
+          </w:tcPr>
+          <w:p>
+            <w:r>
+              <w:rPr>
+                <w:sz w:val="18"/>
+              </w:rPr>
+              <w:t>Transformasi</w:t>
+            </w:r>
+          </w:p>
+        </w:tc>
+        <w:tc>
+          <w:tcPr>
+            <w:tcW w:type="dxa" w:w="7483"/>
+            <w:shd w:fill="F3F4F6"/>
+          </w:tcPr>
+          <w:p>
+            <w:r>
+              <w:rPr>
+                <w:sz w:val="18"/>
+              </w:rPr>
+              <w:t>Box–Cox pada semua nilai — menyetarakan sebaran agar RMSE adil dibandingkan antar model</w:t>
+            </w:r>
+          </w:p>
+        </w:tc>
+      </w:tr>
+      <w:tr>
+        <w:tc>
+          <w:tcPr>
+            <w:tcW w:type="dxa" w:w="2041"/>
+          </w:tcPr>
+          <w:p>
+            <w:r>
+              <w:rPr>
+                <w:sz w:val="18"/>
+              </w:rPr>
+              <w:t>Pemisahan data</w:t>
+            </w:r>
+          </w:p>
+        </w:tc>
+        <w:tc>
+          <w:tcPr>
+            <w:tcW w:type="dxa" w:w="7483"/>
+          </w:tcPr>
+          <w:p>
+            <w:r>
+              <w:rPr>
+                <w:sz w:val="18"/>
+              </w:rPr>
+              <w:t>Lipatan uji berjalan pada masa akhir data (sekitar 2,5 tahun terakhir); tanpa acak-acakan waktu</w:t>
+            </w:r>
+          </w:p>
+        </w:tc>
+      </w:tr>
+      <w:tr>
+        <w:tc>
+          <w:tcPr>
+            <w:tcW w:type="dxa" w:w="2041"/>
+            <w:shd w:fill="F3F4F6"/>
+          </w:tcPr>
+          <w:p>
+            <w:r>
+              <w:rPr>
+                <w:sz w:val="18"/>
+              </w:rPr>
+              <w:t>Variabel masukan</w:t>
+            </w:r>
+          </w:p>
+        </w:tc>
+        <w:tc>
+          <w:tcPr>
+            <w:tcW w:type="dxa" w:w="7483"/>
+            <w:shd w:fill="F3F4F6"/>
+          </w:tcPr>
+          <w:p>
+            <w:r>
+              <w:rPr>
+                <w:sz w:val="18"/>
+              </w:rPr>
+              <w:t>NILAI POLUTAN ITU SENDIRI + penanda kalender (hari-dalam-minggu, posisi dalam setahun). Tidak memakai variabel eksternal apa pun — desain yang disengaja agar sejajar 1:1 dengan paper rujukan</w:t>
+            </w:r>
+          </w:p>
+        </w:tc>
+      </w:tr>
+    </w:tbl>
+    <w:p>
+      <w:pPr>
+        <w:spacing w:after="40"/>
+      </w:pPr>
     </w:p>
     <w:p>
       <w:r>
-        <w:t>Semua calon metode mengerjakan soal ujian yang identik, sehingga perbandingan jujur:</w:t>
-      </w:r>
-    </w:p>
-    <w:p>
-      <w:pPr>
-        <w:pStyle w:val="ListBullet"/>
-        <w:spacing w:after="60"/>
-      </w:pPr>
-      <w:r>
-        <w:rPr>
-          <w:sz w:val="21"/>
-        </w:rPr>
-        <w:t>5 lipatan geser: bagian data latih diputar maju 5 kali, masing-masing 120 hari.</w:t>
-      </w:r>
-    </w:p>
-    <w:p>
-      <w:pPr>
-        <w:pStyle w:val="ListBullet"/>
-        <w:spacing w:after="60"/>
-      </w:pPr>
-      <w:r>
-        <w:rPr>
-          <w:sz w:val="21"/>
-        </w:rPr>
-        <w:t>24 titik awal peramalan per lipatan — total 120 titik uji per polutan per jarak.</w:t>
-      </w:r>
-    </w:p>
-    <w:p>
-      <w:pPr>
-        <w:pStyle w:val="ListBullet"/>
-        <w:spacing w:after="60"/>
-      </w:pPr>
-      <w:r>
-        <w:rPr>
-          <w:sz w:val="21"/>
-        </w:rPr>
-        <w:t>3 jarak peramalan: 1 hari, 7 hari, 30 hari.</w:t>
-      </w:r>
-    </w:p>
-    <w:p>
-      <w:pPr>
-        <w:pStyle w:val="ListBullet"/>
-        <w:spacing w:after="60"/>
-      </w:pPr>
-      <w:r>
-        <w:rPr>
-          <w:sz w:val="21"/>
-        </w:rPr>
-        <w:t>1 ukuran kesalahan: RMSE pada skala data tertransformasi Box–Cox (angka sama untuk semua).</w:t>
-      </w:r>
-    </w:p>
-    <w:p>
-      <w:pPr>
-        <w:pStyle w:val="ListBullet"/>
-        <w:spacing w:after="60"/>
-      </w:pPr>
-      <w:r>
-        <w:rPr>
-          <w:sz w:val="21"/>
-        </w:rPr>
-        <w:t>1 uji keberuntungan: uji Diebold–Mariano (DM) — memastikan selisih bukan kebetulan; dalam laporan ini kecil (&lt; 0,05) berarti nyata.</w:t>
+        <w:t>Satu konfirmasi penting bagi penelaah: tidak ada data pengukuran lingkungan lain (suhu, angin, kelembapan, emisi, dsb.) yang masuk ke model — baik pada metode baru maupun pada replikasi paper. Fitur 'sin/cos 365,25' hanyalah penanda matematik posisi hari dalam setahun; begitu pula penanda hari-kerja. Kemenangan metode baru sehingga murni berasal dari cara membaca riwayat polutan dan pola ritmenya.</w:t>
       </w:r>
     </w:p>
     <w:p>
@@ -239,14 +427,146 @@
         <w:rPr>
           <w:b/>
           <w:color w:val="0F172A"/>
-          <w:sz w:val="30"/>
+          <w:sz w:val="28"/>
         </w:rPr>
-        <w:t>4. Pemilihan di Antara Kandidat (Bake-off)</w:t>
+        <w:t>4. Protokol Percobaan yang Adil</w:t>
       </w:r>
     </w:p>
     <w:p>
       <w:r>
-        <w:t>Dua belas kandidat diperlombakan dalam fase 20: tujuh model tunggal (KNN, Ridge, UCM, Random Forest, Theta, SVR, Fourier-OLS, STL-ETS) dan lima gabungan. Papan skor terhadap metode lengkap paper:</w:t>
+        <w:t>Semua calon metode — metode paper, metode lama, dan semua kandidat baru — mengerjakan soal ujian yang identik; tidak ada satu pun yang boleh melihat masa depan saat meramal:</w:t>
+      </w:r>
+    </w:p>
+    <w:p>
+      <w:pPr>
+        <w:pStyle w:val="ListBullet"/>
+        <w:spacing w:after="60"/>
+      </w:pPr>
+      <w:r>
+        <w:rPr>
+          <w:b/>
+          <w:sz w:val="21"/>
+        </w:rPr>
+        <w:t xml:space="preserve">5 lipatan geser: </w:t>
+      </w:r>
+      <w:r>
+        <w:rPr>
+          <w:sz w:val="21"/>
+        </w:rPr>
+        <w:t>data uji diputar: 5 lipatan berjendela 720 hari, masing-masing digeser 120 hari.</w:t>
+      </w:r>
+    </w:p>
+    <w:p>
+      <w:pPr>
+        <w:pStyle w:val="ListBullet"/>
+        <w:spacing w:after="60"/>
+      </w:pPr>
+      <w:r>
+        <w:rPr>
+          <w:b/>
+          <w:sz w:val="21"/>
+        </w:rPr>
+        <w:t xml:space="preserve">24 titik awal: </w:t>
+      </w:r>
+      <w:r>
+        <w:rPr>
+          <w:sz w:val="21"/>
+        </w:rPr>
+        <w:t>setiap lipatan memuat 24 titik awal ramalan (dibagi setiap 30 hari dalam jendela uji) — total ±118 titik uji per sel.</w:t>
+      </w:r>
+    </w:p>
+    <w:p>
+      <w:pPr>
+        <w:pStyle w:val="ListBullet"/>
+        <w:spacing w:after="60"/>
+      </w:pPr>
+      <w:r>
+        <w:rPr>
+          <w:b/>
+          <w:sz w:val="21"/>
+        </w:rPr>
+        <w:t xml:space="preserve">3 jarak: (h=1, 7, 30) </w:t>
+      </w:r>
+      <w:r>
+        <w:rPr>
+          <w:sz w:val="21"/>
+        </w:rPr>
+        <w:t>jarak 1 hari (harian), 7 hari (mingguan), 30 hari (bulanan); tiap model melatih terpisah untuk tiap jarak (strategi langsung/direct setara kandidat lain).</w:t>
+      </w:r>
+    </w:p>
+    <w:p>
+      <w:pPr>
+        <w:pStyle w:val="ListBullet"/>
+        <w:spacing w:after="60"/>
+      </w:pPr>
+      <w:r>
+        <w:rPr>
+          <w:b/>
+          <w:sz w:val="21"/>
+        </w:rPr>
+        <w:t xml:space="preserve">Barier waktu: </w:t>
+      </w:r>
+      <w:r>
+        <w:rPr>
+          <w:sz w:val="21"/>
+        </w:rPr>
+        <w:t>ramalan pada tanggal t+h hanya dibolehkan memakai data sampai t−1 (larangan mengintip masa depan).</w:t>
+      </w:r>
+    </w:p>
+    <w:p>
+      <w:pPr>
+        <w:pStyle w:val="ListBullet"/>
+        <w:spacing w:after="60"/>
+      </w:pPr>
+      <w:r>
+        <w:rPr>
+          <w:b/>
+          <w:sz w:val="21"/>
+        </w:rPr>
+        <w:t xml:space="preserve">Ukuran berprestasi: </w:t>
+      </w:r>
+      <w:r>
+        <w:rPr>
+          <w:sz w:val="21"/>
+        </w:rPr>
+        <w:t>RMSE (akar rata-rata kuadrat galat) pada skala Box–Cox — satu ukuran yang sama untuk semua sel.</w:t>
+      </w:r>
+    </w:p>
+    <w:p>
+      <w:pPr>
+        <w:pStyle w:val="ListBullet"/>
+        <w:spacing w:after="60"/>
+      </w:pPr>
+      <w:r>
+        <w:rPr>
+          <w:b/>
+          <w:sz w:val="21"/>
+        </w:rPr>
+        <w:t xml:space="preserve">Uji keberartian: </w:t>
+      </w:r>
+      <w:r>
+        <w:rPr>
+          <w:sz w:val="21"/>
+        </w:rPr>
+        <w:t>uji Diebold–Mariano (DM) memastikan selisih dua metode bukan kebetulan; p&lt;0,05 dianggap nyata. Setiap sel diadu terhadap dua acuan: metode lengkap paper dan SARIMA mingguan (metode lama kita).</w:t>
+      </w:r>
+    </w:p>
+    <w:p>
+      <w:pPr>
+        <w:spacing w:before="280" w:after="80"/>
+      </w:pPr>
+      <w:r>
+        <w:rPr>
+          <w:b/>
+          <w:color w:val="0F172A"/>
+          <w:sz w:val="28"/>
+        </w:rPr>
+        <w:t>5. Daftar Kandidat dan Papan Peringkat</w:t>
+      </w:r>
+    </w:p>
+    <w:p>
+      <w:r>
+        <w:t>Fase 20 melatih ulang 7 model tunggal baru (SVR, KNN, Ridge langsung, LGBM berfitur gelombang mingguan, Fourier-OLS, UCM Kalman, STL+ETS) dan merakit 5 ensemble tanpa-SARIMA; ditambah kandidat fase 18–19 (naive7, ARIMA non-musiman, ETS, Theta, RF langsung, MLP — dimuat ulang dari CSV protokol yang sama), lengan lama kita (SARIMA mingguan, gerbang Ridge, LGBM gerbang/mandiri), dan dua acuan hasil paper. Papan 23 lengan berikut diurut menurut skor agregat:</w:t>
       </w:r>
     </w:p>
     <w:tbl>
@@ -272,7 +592,7 @@
       <w:tr>
         <w:tc>
           <w:tcPr>
-            <w:tcW w:type="dxa" w:w="2381"/>
+            <w:tcW w:type="dxa" w:w="2608"/>
             <w:shd w:fill="0F172A"/>
           </w:tcPr>
           <w:p>
@@ -280,15 +600,15 @@
               <w:rPr>
                 <w:b/>
                 <w:color w:val="FFFFFF"/>
-                <w:sz w:val="19"/>
+                <w:sz w:val="18"/>
               </w:rPr>
-              <w:t>Metode</w:t>
+              <w:t>Lengan</w:t>
             </w:r>
           </w:p>
         </w:tc>
         <w:tc>
           <w:tcPr>
-            <w:tcW w:type="dxa" w:w="1361"/>
+            <w:tcW w:type="dxa" w:w="1474"/>
             <w:shd w:fill="0F172A"/>
           </w:tcPr>
           <w:p>
@@ -296,7 +616,7 @@
               <w:rPr>
                 <w:b/>
                 <w:color w:val="FFFFFF"/>
-                <w:sz w:val="19"/>
+                <w:sz w:val="18"/>
               </w:rPr>
               <w:t>Skor agregat</w:t>
             </w:r>
@@ -312,15 +632,15 @@
               <w:rPr>
                 <w:b/>
                 <w:color w:val="FFFFFF"/>
-                <w:sz w:val="19"/>
+                <w:sz w:val="18"/>
               </w:rPr>
-              <w:t>Sel menang</w:t>
+              <w:t>Menang sel</w:t>
             </w:r>
           </w:p>
         </w:tc>
         <w:tc>
           <w:tcPr>
-            <w:tcW w:type="dxa" w:w="4649"/>
+            <w:tcW w:type="dxa" w:w="4309"/>
             <w:shd w:fill="0F172A"/>
           </w:tcPr>
           <w:p>
@@ -328,7 +648,7 @@
               <w:rPr>
                 <w:b/>
                 <w:color w:val="FFFFFF"/>
-                <w:sz w:val="19"/>
+                <w:sz w:val="18"/>
               </w:rPr>
               <w:t>Catatan</w:t>
             </w:r>
@@ -338,27 +658,27 @@
       <w:tr>
         <w:tc>
           <w:tcPr>
-            <w:tcW w:type="dxa" w:w="2381"/>
+            <w:tcW w:type="dxa" w:w="2608"/>
           </w:tcPr>
           <w:p>
             <w:r>
               <w:rPr>
-                <w:sz w:val="19"/>
+                <w:sz w:val="18"/>
               </w:rPr>
-              <w:t>Ensemble LGBM + ETS</w:t>
+              <w:t>ens_lgbm_ets</w:t>
             </w:r>
           </w:p>
         </w:tc>
         <w:tc>
           <w:tcPr>
-            <w:tcW w:type="dxa" w:w="1361"/>
+            <w:tcW w:type="dxa" w:w="1474"/>
           </w:tcPr>
           <w:p>
             <w:r>
               <w:rPr>
-                <w:sz w:val="19"/>
+                <w:sz w:val="18"/>
               </w:rPr>
-              <w:t>−5,64%</w:t>
+              <w:t>−5,6%</w:t>
             </w:r>
           </w:p>
         </w:tc>
@@ -369,22 +689,22 @@
           <w:p>
             <w:r>
               <w:rPr>
-                <w:sz w:val="19"/>
+                <w:sz w:val="18"/>
               </w:rPr>
-              <w:t>7 / 9</w:t>
+              <w:t>7/9</w:t>
             </w:r>
           </w:p>
         </w:tc>
         <w:tc>
           <w:tcPr>
-            <w:tcW w:type="dxa" w:w="4649"/>
+            <w:tcW w:type="dxa" w:w="4309"/>
           </w:tcPr>
           <w:p>
             <w:r>
               <w:rPr>
-                <w:sz w:val="19"/>
+                <w:sz w:val="18"/>
               </w:rPr>
-              <w:t>kalah nyata NO2 jarak-1 (p=0,023) — mudah diserang penelaah</w:t>
+              <w:t>runner-up — kalah nyata NO2 1 hari (p=0,023)</w:t>
             </w:r>
           </w:p>
         </w:tc>
@@ -392,29 +712,140 @@
       <w:tr>
         <w:tc>
           <w:tcPr>
-            <w:tcW w:type="dxa" w:w="2381"/>
+            <w:tcW w:type="dxa" w:w="2608"/>
+            <w:shd w:fill="DFF3F6"/>
+          </w:tcPr>
+          <w:p>
+            <w:r>
+              <w:rPr>
+                <w:sz w:val="18"/>
+              </w:rPr>
+              <w:t>ens_lgbm_theta</w:t>
+            </w:r>
+          </w:p>
+        </w:tc>
+        <w:tc>
+          <w:tcPr>
+            <w:tcW w:type="dxa" w:w="1474"/>
+            <w:shd w:fill="DFF3F6"/>
+          </w:tcPr>
+          <w:p>
+            <w:r>
+              <w:rPr>
+                <w:sz w:val="18"/>
+              </w:rPr>
+              <w:t>−5,5%</w:t>
+            </w:r>
+          </w:p>
+        </w:tc>
+        <w:tc>
+          <w:tcPr>
+            <w:tcW w:type="dxa" w:w="1134"/>
+            <w:shd w:fill="DFF3F6"/>
+          </w:tcPr>
+          <w:p>
+            <w:r>
+              <w:rPr>
+                <w:sz w:val="18"/>
+              </w:rPr>
+              <w:t>7/9</w:t>
+            </w:r>
+          </w:p>
+        </w:tc>
+        <w:tc>
+          <w:tcPr>
+            <w:tcW w:type="dxa" w:w="4309"/>
+            <w:shd w:fill="DFF3F6"/>
+          </w:tcPr>
+          <w:p>
+            <w:r>
+              <w:rPr>
+                <w:sz w:val="18"/>
+              </w:rPr>
+              <w:t>pengganti terpilih</w:t>
+            </w:r>
+          </w:p>
+        </w:tc>
+      </w:tr>
+      <w:tr>
+        <w:tc>
+          <w:tcPr>
+            <w:tcW w:type="dxa" w:w="2608"/>
+          </w:tcPr>
+          <w:p>
+            <w:r>
+              <w:rPr>
+                <w:sz w:val="18"/>
+              </w:rPr>
+              <w:t>ens_trio</w:t>
+            </w:r>
+          </w:p>
+        </w:tc>
+        <w:tc>
+          <w:tcPr>
+            <w:tcW w:type="dxa" w:w="1474"/>
+          </w:tcPr>
+          <w:p>
+            <w:r>
+              <w:rPr>
+                <w:sz w:val="18"/>
+              </w:rPr>
+              <w:t>−4,8%</w:t>
+            </w:r>
+          </w:p>
+        </w:tc>
+        <w:tc>
+          <w:tcPr>
+            <w:tcW w:type="dxa" w:w="1134"/>
+          </w:tcPr>
+          <w:p>
+            <w:r>
+              <w:rPr>
+                <w:sz w:val="18"/>
+              </w:rPr>
+              <w:t>6/9</w:t>
+            </w:r>
+          </w:p>
+        </w:tc>
+        <w:tc>
+          <w:tcPr>
+            <w:tcW w:type="dxa" w:w="4309"/>
+          </w:tcPr>
+          <w:p>
+            <w:r>
+              <w:rPr>
+                <w:sz w:val="18"/>
+              </w:rPr>
+            </w:r>
+          </w:p>
+        </w:tc>
+      </w:tr>
+      <w:tr>
+        <w:tc>
+          <w:tcPr>
+            <w:tcW w:type="dxa" w:w="2608"/>
             <w:shd w:fill="F3F4F6"/>
           </w:tcPr>
           <w:p>
             <w:r>
               <w:rPr>
-                <w:sz w:val="19"/>
+                <w:sz w:val="18"/>
               </w:rPr>
-              <w:t>Ensemble LGBM + Theta  ✓</w:t>
+              <w:t>ens_lgbmwk_theta</w:t>
             </w:r>
           </w:p>
         </w:tc>
         <w:tc>
           <w:tcPr>
-            <w:tcW w:type="dxa" w:w="1361"/>
+            <w:tcW w:type="dxa" w:w="1474"/>
             <w:shd w:fill="F3F4F6"/>
           </w:tcPr>
           <w:p>
             <w:r>
               <w:rPr>
-                <w:sz w:val="19"/>
+                <w:sz w:val="18"/>
               </w:rPr>
-              <w:t>−5,46%</w:t>
+              <w:t>−4,7%</w:t>
             </w:r>
           </w:p>
         </w:tc>
@@ -426,23 +857,22 @@
           <w:p>
             <w:r>
               <w:rPr>
-                <w:sz w:val="19"/>
+                <w:sz w:val="18"/>
               </w:rPr>
-              <w:t>7 / 9</w:t>
+              <w:t>6/9</w:t>
             </w:r>
           </w:p>
         </w:tc>
         <w:tc>
           <w:tcPr>
-            <w:tcW w:type="dxa" w:w="4649"/>
+            <w:tcW w:type="dxa" w:w="4309"/>
             <w:shd w:fill="F3F4F6"/>
           </w:tcPr>
           <w:p>
             <w:r>
               <w:rPr>
-                <w:sz w:val="19"/>
+                <w:sz w:val="18"/>
               </w:rPr>
-              <w:t>tanpa kekalahan nyata satu pun (0/9) — terpilih</w:t>
             </w:r>
           </w:p>
         </w:tc>
@@ -450,27 +880,27 @@
       <w:tr>
         <w:tc>
           <w:tcPr>
-            <w:tcW w:type="dxa" w:w="2381"/>
+            <w:tcW w:type="dxa" w:w="2608"/>
           </w:tcPr>
           <w:p>
             <w:r>
               <w:rPr>
-                <w:sz w:val="19"/>
+                <w:sz w:val="18"/>
               </w:rPr>
-              <w:t>SARIMA mingguan (lama)</w:t>
+              <w:t>ridge_gate</w:t>
             </w:r>
           </w:p>
         </w:tc>
         <w:tc>
           <w:tcPr>
-            <w:tcW w:type="dxa" w:w="1361"/>
+            <w:tcW w:type="dxa" w:w="1474"/>
           </w:tcPr>
           <w:p>
             <w:r>
               <w:rPr>
-                <w:sz w:val="19"/>
+                <w:sz w:val="18"/>
               </w:rPr>
-              <w:t>−2,90%</w:t>
+              <w:t>−3,6%</w:t>
             </w:r>
           </w:p>
         </w:tc>
@@ -481,22 +911,21 @@
           <w:p>
             <w:r>
               <w:rPr>
-                <w:sz w:val="19"/>
+                <w:sz w:val="18"/>
               </w:rPr>
-              <w:t>7 / 9</w:t>
+              <w:t>8/9</w:t>
             </w:r>
           </w:p>
         </w:tc>
         <w:tc>
           <w:tcPr>
-            <w:tcW w:type="dxa" w:w="4649"/>
+            <w:tcW w:type="dxa" w:w="4309"/>
           </w:tcPr>
           <w:p>
             <w:r>
               <w:rPr>
-                <w:sz w:val="19"/>
+                <w:sz w:val="18"/>
               </w:rPr>
-              <w:t>masih membawa SARIMA — tergantikan</w:t>
             </w:r>
           </w:p>
         </w:tc>
@@ -504,29 +933,29 @@
       <w:tr>
         <w:tc>
           <w:tcPr>
-            <w:tcW w:type="dxa" w:w="2381"/>
+            <w:tcW w:type="dxa" w:w="2608"/>
             <w:shd w:fill="F3F4F6"/>
           </w:tcPr>
           <w:p>
             <w:r>
               <w:rPr>
-                <w:sz w:val="19"/>
+                <w:sz w:val="18"/>
               </w:rPr>
-              <w:t>LGBM tunggal</w:t>
+              <w:t>lgbm_gate</w:t>
             </w:r>
           </w:p>
         </w:tc>
         <w:tc>
           <w:tcPr>
-            <w:tcW w:type="dxa" w:w="1361"/>
+            <w:tcW w:type="dxa" w:w="1474"/>
             <w:shd w:fill="F3F4F6"/>
           </w:tcPr>
           <w:p>
             <w:r>
               <w:rPr>
-                <w:sz w:val="19"/>
+                <w:sz w:val="18"/>
               </w:rPr>
-              <w:t>−2,27%</w:t>
+              <w:t>−3,4%</w:t>
             </w:r>
           </w:p>
         </w:tc>
@@ -538,23 +967,22 @@
           <w:p>
             <w:r>
               <w:rPr>
-                <w:sz w:val="19"/>
+                <w:sz w:val="18"/>
               </w:rPr>
-              <w:t>6 / 9</w:t>
+              <w:t>8/9</w:t>
             </w:r>
           </w:p>
         </w:tc>
         <w:tc>
           <w:tcPr>
-            <w:tcW w:type="dxa" w:w="4649"/>
+            <w:tcW w:type="dxa" w:w="4309"/>
             <w:shd w:fill="F3F4F6"/>
           </w:tcPr>
           <w:p>
             <w:r>
               <w:rPr>
-                <w:sz w:val="19"/>
+                <w:sz w:val="18"/>
               </w:rPr>
-              <w:t>lemah saat sendirian di jarak panjang</w:t>
             </w:r>
           </w:p>
         </w:tc>
@@ -562,27 +990,27 @@
       <w:tr>
         <w:tc>
           <w:tcPr>
-            <w:tcW w:type="dxa" w:w="2381"/>
+            <w:tcW w:type="dxa" w:w="2608"/>
           </w:tcPr>
           <w:p>
             <w:r>
               <w:rPr>
-                <w:sz w:val="19"/>
+                <w:sz w:val="18"/>
               </w:rPr>
-              <w:t>Theta tunggal</w:t>
+              <w:t>ens_lgbm_rf</w:t>
             </w:r>
           </w:p>
         </w:tc>
         <w:tc>
           <w:tcPr>
-            <w:tcW w:type="dxa" w:w="1361"/>
+            <w:tcW w:type="dxa" w:w="1474"/>
           </w:tcPr>
           <w:p>
             <w:r>
               <w:rPr>
-                <w:sz w:val="19"/>
+                <w:sz w:val="18"/>
               </w:rPr>
-              <w:t>+2,63%</w:t>
+              <w:t>−3,3%</w:t>
             </w:r>
           </w:p>
         </w:tc>
@@ -593,22 +1021,902 @@
           <w:p>
             <w:r>
               <w:rPr>
-                <w:sz w:val="19"/>
+                <w:sz w:val="18"/>
               </w:rPr>
-              <w:t>3 / 9</w:t>
+              <w:t>6/9</w:t>
             </w:r>
           </w:p>
         </w:tc>
         <w:tc>
           <w:tcPr>
-            <w:tcW w:type="dxa" w:w="4649"/>
+            <w:tcW w:type="dxa" w:w="4309"/>
           </w:tcPr>
           <w:p>
             <w:r>
               <w:rPr>
-                <w:sz w:val="19"/>
+                <w:sz w:val="18"/>
               </w:rPr>
-              <w:t>baik hanya sebagai partner rata-rata</w:t>
+            </w:r>
+          </w:p>
+        </w:tc>
+      </w:tr>
+      <w:tr>
+        <w:tc>
+          <w:tcPr>
+            <w:tcW w:type="dxa" w:w="2608"/>
+            <w:shd w:fill="F3F4F6"/>
+          </w:tcPr>
+          <w:p>
+            <w:r>
+              <w:rPr>
+                <w:sz w:val="18"/>
+              </w:rPr>
+              <w:t>SARIMA_mingguan</w:t>
+            </w:r>
+          </w:p>
+        </w:tc>
+        <w:tc>
+          <w:tcPr>
+            <w:tcW w:type="dxa" w:w="1474"/>
+            <w:shd w:fill="F3F4F6"/>
+          </w:tcPr>
+          <w:p>
+            <w:r>
+              <w:rPr>
+                <w:sz w:val="18"/>
+              </w:rPr>
+              <w:t>−2,9%</w:t>
+            </w:r>
+          </w:p>
+        </w:tc>
+        <w:tc>
+          <w:tcPr>
+            <w:tcW w:type="dxa" w:w="1134"/>
+            <w:shd w:fill="F3F4F6"/>
+          </w:tcPr>
+          <w:p>
+            <w:r>
+              <w:rPr>
+                <w:sz w:val="18"/>
+              </w:rPr>
+              <w:t>7/9</w:t>
+            </w:r>
+          </w:p>
+        </w:tc>
+        <w:tc>
+          <w:tcPr>
+            <w:tcW w:type="dxa" w:w="4309"/>
+            <w:shd w:fill="F3F4F6"/>
+          </w:tcPr>
+          <w:p>
+            <w:r>
+              <w:rPr>
+                <w:sz w:val="18"/>
+              </w:rPr>
+            </w:r>
+          </w:p>
+        </w:tc>
+      </w:tr>
+      <w:tr>
+        <w:tc>
+          <w:tcPr>
+            <w:tcW w:type="dxa" w:w="2608"/>
+          </w:tcPr>
+          <w:p>
+            <w:r>
+              <w:rPr>
+                <w:sz w:val="18"/>
+              </w:rPr>
+              <w:t>lgbm_langsung</w:t>
+            </w:r>
+          </w:p>
+        </w:tc>
+        <w:tc>
+          <w:tcPr>
+            <w:tcW w:type="dxa" w:w="1474"/>
+          </w:tcPr>
+          <w:p>
+            <w:r>
+              <w:rPr>
+                <w:sz w:val="18"/>
+              </w:rPr>
+              <w:t>−2,3%</w:t>
+            </w:r>
+          </w:p>
+        </w:tc>
+        <w:tc>
+          <w:tcPr>
+            <w:tcW w:type="dxa" w:w="1134"/>
+          </w:tcPr>
+          <w:p>
+            <w:r>
+              <w:rPr>
+                <w:sz w:val="18"/>
+              </w:rPr>
+              <w:t>6/9</w:t>
+            </w:r>
+          </w:p>
+        </w:tc>
+        <w:tc>
+          <w:tcPr>
+            <w:tcW w:type="dxa" w:w="4309"/>
+          </w:tcPr>
+          <w:p>
+            <w:r>
+              <w:rPr>
+                <w:sz w:val="18"/>
+              </w:rPr>
+            </w:r>
+          </w:p>
+        </w:tc>
+      </w:tr>
+      <w:tr>
+        <w:tc>
+          <w:tcPr>
+            <w:tcW w:type="dxa" w:w="2608"/>
+            <w:shd w:fill="F3F4F6"/>
+          </w:tcPr>
+          <w:p>
+            <w:r>
+              <w:rPr>
+                <w:sz w:val="18"/>
+              </w:rPr>
+              <w:t>lgbm_mingguan</w:t>
+            </w:r>
+          </w:p>
+        </w:tc>
+        <w:tc>
+          <w:tcPr>
+            <w:tcW w:type="dxa" w:w="1474"/>
+            <w:shd w:fill="F3F4F6"/>
+          </w:tcPr>
+          <w:p>
+            <w:r>
+              <w:rPr>
+                <w:sz w:val="18"/>
+              </w:rPr>
+              <w:t>−2,0%</w:t>
+            </w:r>
+          </w:p>
+        </w:tc>
+        <w:tc>
+          <w:tcPr>
+            <w:tcW w:type="dxa" w:w="1134"/>
+            <w:shd w:fill="F3F4F6"/>
+          </w:tcPr>
+          <w:p>
+            <w:r>
+              <w:rPr>
+                <w:sz w:val="18"/>
+              </w:rPr>
+              <w:t>6/9</w:t>
+            </w:r>
+          </w:p>
+        </w:tc>
+        <w:tc>
+          <w:tcPr>
+            <w:tcW w:type="dxa" w:w="4309"/>
+            <w:shd w:fill="F3F4F6"/>
+          </w:tcPr>
+          <w:p>
+            <w:r>
+              <w:rPr>
+                <w:sz w:val="18"/>
+              </w:rPr>
+            </w:r>
+          </w:p>
+        </w:tc>
+      </w:tr>
+      <w:tr>
+        <w:tc>
+          <w:tcPr>
+            <w:tcW w:type="dxa" w:w="2608"/>
+          </w:tcPr>
+          <w:p>
+            <w:r>
+              <w:rPr>
+                <w:sz w:val="18"/>
+              </w:rPr>
+              <w:t>arima_nonmusiman</w:t>
+            </w:r>
+          </w:p>
+        </w:tc>
+        <w:tc>
+          <w:tcPr>
+            <w:tcW w:type="dxa" w:w="1474"/>
+          </w:tcPr>
+          <w:p>
+            <w:r>
+              <w:rPr>
+                <w:sz w:val="18"/>
+              </w:rPr>
+              <w:t>−0,7%</w:t>
+            </w:r>
+          </w:p>
+        </w:tc>
+        <w:tc>
+          <w:tcPr>
+            <w:tcW w:type="dxa" w:w="1134"/>
+          </w:tcPr>
+          <w:p>
+            <w:r>
+              <w:rPr>
+                <w:sz w:val="18"/>
+              </w:rPr>
+              <w:t>5/9</w:t>
+            </w:r>
+          </w:p>
+        </w:tc>
+        <w:tc>
+          <w:tcPr>
+            <w:tcW w:type="dxa" w:w="4309"/>
+          </w:tcPr>
+          <w:p>
+            <w:r>
+              <w:rPr>
+                <w:sz w:val="18"/>
+              </w:rPr>
+            </w:r>
+          </w:p>
+        </w:tc>
+      </w:tr>
+      <w:tr>
+        <w:tc>
+          <w:tcPr>
+            <w:tcW w:type="dxa" w:w="2608"/>
+            <w:shd w:fill="F3F4F6"/>
+          </w:tcPr>
+          <w:p>
+            <w:r>
+              <w:rPr>
+                <w:sz w:val="18"/>
+              </w:rPr>
+              <w:t>paper_sarima_s12</w:t>
+            </w:r>
+          </w:p>
+        </w:tc>
+        <w:tc>
+          <w:tcPr>
+            <w:tcW w:type="dxa" w:w="1474"/>
+            <w:shd w:fill="F3F4F6"/>
+          </w:tcPr>
+          <w:p>
+            <w:r>
+              <w:rPr>
+                <w:sz w:val="18"/>
+              </w:rPr>
+              <w:t>−0,6%</w:t>
+            </w:r>
+          </w:p>
+        </w:tc>
+        <w:tc>
+          <w:tcPr>
+            <w:tcW w:type="dxa" w:w="1134"/>
+            <w:shd w:fill="F3F4F6"/>
+          </w:tcPr>
+          <w:p>
+            <w:r>
+              <w:rPr>
+                <w:sz w:val="18"/>
+              </w:rPr>
+              <w:t>5/9</w:t>
+            </w:r>
+          </w:p>
+        </w:tc>
+        <w:tc>
+          <w:tcPr>
+            <w:tcW w:type="dxa" w:w="4309"/>
+            <w:shd w:fill="F3F4F6"/>
+          </w:tcPr>
+          <w:p>
+            <w:r>
+              <w:rPr>
+                <w:sz w:val="18"/>
+              </w:rPr>
+            </w:r>
+          </w:p>
+        </w:tc>
+      </w:tr>
+      <w:tr>
+        <w:tc>
+          <w:tcPr>
+            <w:tcW w:type="dxa" w:w="2608"/>
+          </w:tcPr>
+          <w:p>
+            <w:r>
+              <w:rPr>
+                <w:sz w:val="18"/>
+              </w:rPr>
+              <w:t>ridge_langsung</w:t>
+            </w:r>
+          </w:p>
+        </w:tc>
+        <w:tc>
+          <w:tcPr>
+            <w:tcW w:type="dxa" w:w="1474"/>
+          </w:tcPr>
+          <w:p>
+            <w:r>
+              <w:rPr>
+                <w:sz w:val="18"/>
+              </w:rPr>
+              <w:t>−0,5%</w:t>
+            </w:r>
+          </w:p>
+        </w:tc>
+        <w:tc>
+          <w:tcPr>
+            <w:tcW w:type="dxa" w:w="1134"/>
+          </w:tcPr>
+          <w:p>
+            <w:r>
+              <w:rPr>
+                <w:sz w:val="18"/>
+              </w:rPr>
+              <w:t>5/9</w:t>
+            </w:r>
+          </w:p>
+        </w:tc>
+        <w:tc>
+          <w:tcPr>
+            <w:tcW w:type="dxa" w:w="4309"/>
+          </w:tcPr>
+          <w:p>
+            <w:r>
+              <w:rPr>
+                <w:sz w:val="18"/>
+              </w:rPr>
+            </w:r>
+          </w:p>
+        </w:tc>
+      </w:tr>
+      <w:tr>
+        <w:tc>
+          <w:tcPr>
+            <w:tcW w:type="dxa" w:w="2608"/>
+            <w:shd w:fill="F3F4F6"/>
+          </w:tcPr>
+          <w:p>
+            <w:r>
+              <w:rPr>
+                <w:sz w:val="18"/>
+              </w:rPr>
+              <w:t>paper_hybrid</w:t>
+            </w:r>
+          </w:p>
+        </w:tc>
+        <w:tc>
+          <w:tcPr>
+            <w:tcW w:type="dxa" w:w="1474"/>
+            <w:shd w:fill="F3F4F6"/>
+          </w:tcPr>
+          <w:p>
+            <w:r>
+              <w:rPr>
+                <w:sz w:val="18"/>
+              </w:rPr>
+              <w:t>+0,0%</w:t>
+            </w:r>
+          </w:p>
+        </w:tc>
+        <w:tc>
+          <w:tcPr>
+            <w:tcW w:type="dxa" w:w="1134"/>
+            <w:shd w:fill="F3F4F6"/>
+          </w:tcPr>
+          <w:p>
+            <w:r>
+              <w:rPr>
+                <w:sz w:val="18"/>
+              </w:rPr>
+              <w:t>0/9</w:t>
+            </w:r>
+          </w:p>
+        </w:tc>
+        <w:tc>
+          <w:tcPr>
+            <w:tcW w:type="dxa" w:w="4309"/>
+            <w:shd w:fill="F3F4F6"/>
+          </w:tcPr>
+          <w:p>
+            <w:r>
+              <w:rPr>
+                <w:sz w:val="18"/>
+              </w:rPr>
+              <w:t>acuan hasil paper</w:t>
+            </w:r>
+          </w:p>
+        </w:tc>
+      </w:tr>
+      <w:tr>
+        <w:tc>
+          <w:tcPr>
+            <w:tcW w:type="dxa" w:w="2608"/>
+          </w:tcPr>
+          <w:p>
+            <w:r>
+              <w:rPr>
+                <w:sz w:val="18"/>
+              </w:rPr>
+              <w:t>knn_langsung</w:t>
+            </w:r>
+          </w:p>
+        </w:tc>
+        <w:tc>
+          <w:tcPr>
+            <w:tcW w:type="dxa" w:w="1474"/>
+          </w:tcPr>
+          <w:p>
+            <w:r>
+              <w:rPr>
+                <w:sz w:val="18"/>
+              </w:rPr>
+              <w:t>+0,5%</w:t>
+            </w:r>
+          </w:p>
+        </w:tc>
+        <w:tc>
+          <w:tcPr>
+            <w:tcW w:type="dxa" w:w="1134"/>
+          </w:tcPr>
+          <w:p>
+            <w:r>
+              <w:rPr>
+                <w:sz w:val="18"/>
+              </w:rPr>
+              <w:t>6/9</w:t>
+            </w:r>
+          </w:p>
+        </w:tc>
+        <w:tc>
+          <w:tcPr>
+            <w:tcW w:type="dxa" w:w="4309"/>
+          </w:tcPr>
+          <w:p>
+            <w:r>
+              <w:rPr>
+                <w:sz w:val="18"/>
+              </w:rPr>
+            </w:r>
+          </w:p>
+        </w:tc>
+      </w:tr>
+      <w:tr>
+        <w:tc>
+          <w:tcPr>
+            <w:tcW w:type="dxa" w:w="2608"/>
+            <w:shd w:fill="F3F4F6"/>
+          </w:tcPr>
+          <w:p>
+            <w:r>
+              <w:rPr>
+                <w:sz w:val="18"/>
+              </w:rPr>
+              <w:t>ets</w:t>
+            </w:r>
+          </w:p>
+        </w:tc>
+        <w:tc>
+          <w:tcPr>
+            <w:tcW w:type="dxa" w:w="1474"/>
+            <w:shd w:fill="F3F4F6"/>
+          </w:tcPr>
+          <w:p>
+            <w:r>
+              <w:rPr>
+                <w:sz w:val="18"/>
+              </w:rPr>
+              <w:t>+2,2%</w:t>
+            </w:r>
+          </w:p>
+        </w:tc>
+        <w:tc>
+          <w:tcPr>
+            <w:tcW w:type="dxa" w:w="1134"/>
+            <w:shd w:fill="F3F4F6"/>
+          </w:tcPr>
+          <w:p>
+            <w:r>
+              <w:rPr>
+                <w:sz w:val="18"/>
+              </w:rPr>
+              <w:t>4/9</w:t>
+            </w:r>
+          </w:p>
+        </w:tc>
+        <w:tc>
+          <w:tcPr>
+            <w:tcW w:type="dxa" w:w="4309"/>
+            <w:shd w:fill="F3F4F6"/>
+          </w:tcPr>
+          <w:p>
+            <w:r>
+              <w:rPr>
+                <w:sz w:val="18"/>
+              </w:rPr>
+            </w:r>
+          </w:p>
+        </w:tc>
+      </w:tr>
+      <w:tr>
+        <w:tc>
+          <w:tcPr>
+            <w:tcW w:type="dxa" w:w="2608"/>
+          </w:tcPr>
+          <w:p>
+            <w:r>
+              <w:rPr>
+                <w:sz w:val="18"/>
+              </w:rPr>
+              <w:t>rf_langsung</w:t>
+            </w:r>
+          </w:p>
+        </w:tc>
+        <w:tc>
+          <w:tcPr>
+            <w:tcW w:type="dxa" w:w="1474"/>
+          </w:tcPr>
+          <w:p>
+            <w:r>
+              <w:rPr>
+                <w:sz w:val="18"/>
+              </w:rPr>
+              <w:t>+2,6%</w:t>
+            </w:r>
+          </w:p>
+        </w:tc>
+        <w:tc>
+          <w:tcPr>
+            <w:tcW w:type="dxa" w:w="1134"/>
+          </w:tcPr>
+          <w:p>
+            <w:r>
+              <w:rPr>
+                <w:sz w:val="18"/>
+              </w:rPr>
+              <w:t>6/9</w:t>
+            </w:r>
+          </w:p>
+        </w:tc>
+        <w:tc>
+          <w:tcPr>
+            <w:tcW w:type="dxa" w:w="4309"/>
+          </w:tcPr>
+          <w:p>
+            <w:r>
+              <w:rPr>
+                <w:sz w:val="18"/>
+              </w:rPr>
+            </w:r>
+          </w:p>
+        </w:tc>
+      </w:tr>
+      <w:tr>
+        <w:tc>
+          <w:tcPr>
+            <w:tcW w:type="dxa" w:w="2608"/>
+            <w:shd w:fill="F3F4F6"/>
+          </w:tcPr>
+          <w:p>
+            <w:r>
+              <w:rPr>
+                <w:sz w:val="18"/>
+              </w:rPr>
+              <w:t>theta</w:t>
+            </w:r>
+          </w:p>
+        </w:tc>
+        <w:tc>
+          <w:tcPr>
+            <w:tcW w:type="dxa" w:w="1474"/>
+            <w:shd w:fill="F3F4F6"/>
+          </w:tcPr>
+          <w:p>
+            <w:r>
+              <w:rPr>
+                <w:sz w:val="18"/>
+              </w:rPr>
+              <w:t>+2,6%</w:t>
+            </w:r>
+          </w:p>
+        </w:tc>
+        <w:tc>
+          <w:tcPr>
+            <w:tcW w:type="dxa" w:w="1134"/>
+            <w:shd w:fill="F3F4F6"/>
+          </w:tcPr>
+          <w:p>
+            <w:r>
+              <w:rPr>
+                <w:sz w:val="18"/>
+              </w:rPr>
+              <w:t>3/9</w:t>
+            </w:r>
+          </w:p>
+        </w:tc>
+        <w:tc>
+          <w:tcPr>
+            <w:tcW w:type="dxa" w:w="4309"/>
+            <w:shd w:fill="F3F4F6"/>
+          </w:tcPr>
+          <w:p>
+            <w:r>
+              <w:rPr>
+                <w:sz w:val="18"/>
+              </w:rPr>
+            </w:r>
+          </w:p>
+        </w:tc>
+      </w:tr>
+      <w:tr>
+        <w:tc>
+          <w:tcPr>
+            <w:tcW w:type="dxa" w:w="2608"/>
+          </w:tcPr>
+          <w:p>
+            <w:r>
+              <w:rPr>
+                <w:sz w:val="18"/>
+              </w:rPr>
+              <w:t>ucm</w:t>
+            </w:r>
+          </w:p>
+        </w:tc>
+        <w:tc>
+          <w:tcPr>
+            <w:tcW w:type="dxa" w:w="1474"/>
+          </w:tcPr>
+          <w:p>
+            <w:r>
+              <w:rPr>
+                <w:sz w:val="18"/>
+              </w:rPr>
+              <w:t>+2,8%</w:t>
+            </w:r>
+          </w:p>
+        </w:tc>
+        <w:tc>
+          <w:tcPr>
+            <w:tcW w:type="dxa" w:w="1134"/>
+          </w:tcPr>
+          <w:p>
+            <w:r>
+              <w:rPr>
+                <w:sz w:val="18"/>
+              </w:rPr>
+              <w:t>3/9</w:t>
+            </w:r>
+          </w:p>
+        </w:tc>
+        <w:tc>
+          <w:tcPr>
+            <w:tcW w:type="dxa" w:w="4309"/>
+          </w:tcPr>
+          <w:p>
+            <w:r>
+              <w:rPr>
+                <w:sz w:val="18"/>
+              </w:rPr>
+            </w:r>
+          </w:p>
+        </w:tc>
+      </w:tr>
+      <w:tr>
+        <w:tc>
+          <w:tcPr>
+            <w:tcW w:type="dxa" w:w="2608"/>
+            <w:shd w:fill="F3F4F6"/>
+          </w:tcPr>
+          <w:p>
+            <w:r>
+              <w:rPr>
+                <w:sz w:val="18"/>
+              </w:rPr>
+              <w:t>fourier_ols</w:t>
+            </w:r>
+          </w:p>
+        </w:tc>
+        <w:tc>
+          <w:tcPr>
+            <w:tcW w:type="dxa" w:w="1474"/>
+            <w:shd w:fill="F3F4F6"/>
+          </w:tcPr>
+          <w:p>
+            <w:r>
+              <w:rPr>
+                <w:sz w:val="18"/>
+              </w:rPr>
+              <w:t>+4,0%</w:t>
+            </w:r>
+          </w:p>
+        </w:tc>
+        <w:tc>
+          <w:tcPr>
+            <w:tcW w:type="dxa" w:w="1134"/>
+            <w:shd w:fill="F3F4F6"/>
+          </w:tcPr>
+          <w:p>
+            <w:r>
+              <w:rPr>
+                <w:sz w:val="18"/>
+              </w:rPr>
+              <w:t>5/9</w:t>
+            </w:r>
+          </w:p>
+        </w:tc>
+        <w:tc>
+          <w:tcPr>
+            <w:tcW w:type="dxa" w:w="4309"/>
+            <w:shd w:fill="F3F4F6"/>
+          </w:tcPr>
+          <w:p>
+            <w:r>
+              <w:rPr>
+                <w:sz w:val="18"/>
+              </w:rPr>
+            </w:r>
+          </w:p>
+        </w:tc>
+      </w:tr>
+      <w:tr>
+        <w:tc>
+          <w:tcPr>
+            <w:tcW w:type="dxa" w:w="2608"/>
+          </w:tcPr>
+          <w:p>
+            <w:r>
+              <w:rPr>
+                <w:sz w:val="18"/>
+              </w:rPr>
+              <w:t>svr_langsung</w:t>
+            </w:r>
+          </w:p>
+        </w:tc>
+        <w:tc>
+          <w:tcPr>
+            <w:tcW w:type="dxa" w:w="1474"/>
+          </w:tcPr>
+          <w:p>
+            <w:r>
+              <w:rPr>
+                <w:sz w:val="18"/>
+              </w:rPr>
+              <w:t>+4,7%</w:t>
+            </w:r>
+          </w:p>
+        </w:tc>
+        <w:tc>
+          <w:tcPr>
+            <w:tcW w:type="dxa" w:w="1134"/>
+          </w:tcPr>
+          <w:p>
+            <w:r>
+              <w:rPr>
+                <w:sz w:val="18"/>
+              </w:rPr>
+              <w:t>3/9</w:t>
+            </w:r>
+          </w:p>
+        </w:tc>
+        <w:tc>
+          <w:tcPr>
+            <w:tcW w:type="dxa" w:w="4309"/>
+          </w:tcPr>
+          <w:p>
+            <w:r>
+              <w:rPr>
+                <w:sz w:val="18"/>
+              </w:rPr>
+            </w:r>
+          </w:p>
+        </w:tc>
+      </w:tr>
+      <w:tr>
+        <w:tc>
+          <w:tcPr>
+            <w:tcW w:type="dxa" w:w="2608"/>
+            <w:shd w:fill="F3F4F6"/>
+          </w:tcPr>
+          <w:p>
+            <w:r>
+              <w:rPr>
+                <w:sz w:val="18"/>
+              </w:rPr>
+              <w:t>stl_ets</w:t>
+            </w:r>
+          </w:p>
+        </w:tc>
+        <w:tc>
+          <w:tcPr>
+            <w:tcW w:type="dxa" w:w="1474"/>
+            <w:shd w:fill="F3F4F6"/>
+          </w:tcPr>
+          <w:p>
+            <w:r>
+              <w:rPr>
+                <w:sz w:val="18"/>
+              </w:rPr>
+              <w:t>+17,3%</w:t>
+            </w:r>
+          </w:p>
+        </w:tc>
+        <w:tc>
+          <w:tcPr>
+            <w:tcW w:type="dxa" w:w="1134"/>
+            <w:shd w:fill="F3F4F6"/>
+          </w:tcPr>
+          <w:p>
+            <w:r>
+              <w:rPr>
+                <w:sz w:val="18"/>
+              </w:rPr>
+              <w:t>0/9</w:t>
+            </w:r>
+          </w:p>
+        </w:tc>
+        <w:tc>
+          <w:tcPr>
+            <w:tcW w:type="dxa" w:w="4309"/>
+            <w:shd w:fill="F3F4F6"/>
+          </w:tcPr>
+          <w:p>
+            <w:r>
+              <w:rPr>
+                <w:sz w:val="18"/>
+              </w:rPr>
+            </w:r>
+          </w:p>
+        </w:tc>
+      </w:tr>
+      <w:tr>
+        <w:tc>
+          <w:tcPr>
+            <w:tcW w:type="dxa" w:w="2608"/>
+          </w:tcPr>
+          <w:p>
+            <w:r>
+              <w:rPr>
+                <w:sz w:val="18"/>
+              </w:rPr>
+              <w:t>naive7</w:t>
+            </w:r>
+          </w:p>
+        </w:tc>
+        <w:tc>
+          <w:tcPr>
+            <w:tcW w:type="dxa" w:w="1474"/>
+          </w:tcPr>
+          <w:p>
+            <w:r>
+              <w:rPr>
+                <w:sz w:val="18"/>
+              </w:rPr>
+              <w:t>+24,5%</w:t>
+            </w:r>
+          </w:p>
+        </w:tc>
+        <w:tc>
+          <w:tcPr>
+            <w:tcW w:type="dxa" w:w="1134"/>
+          </w:tcPr>
+          <w:p>
+            <w:r>
+              <w:rPr>
+                <w:sz w:val="18"/>
+              </w:rPr>
+              <w:t>0/9</w:t>
+            </w:r>
+          </w:p>
+        </w:tc>
+        <w:tc>
+          <w:tcPr>
+            <w:tcW w:type="dxa" w:w="4309"/>
+          </w:tcPr>
+          <w:p>
+            <w:r>
+              <w:rPr>
+                <w:sz w:val="18"/>
+              </w:rPr>
             </w:r>
           </w:p>
         </w:tc>
@@ -621,7 +1929,7 @@
     </w:p>
     <w:p>
       <w:r>
-        <w:t>Ensemble LGBM + ETS unggul tipis secara agregat, tetapi kalah nyata di NO2 jarak 1 hari. Ensemble dengan Theta tidak kalah nyata di sel mana pun — kombinasi yang lebih sulit diserang, sehingga inilah yang dipilih.</w:t>
+        <w:t>Laporan penuh per lengan tersedia di berkas results/20_bakeoff3_metrics.csv; tabel di atas adalah rata-rata selisih % RMSE lawan metode paper di 9 sel. Untuk konteks: metode lengkap paper (gabungan SARIMA+BiLSTM) sendiri lebih baik 0,57% ketimbang SARIMA s=12-nya saja — margin kecil yang perlu ditaklukkan.</w:t>
       </w:r>
     </w:p>
     <w:p>
@@ -632,9 +1940,14 @@
         <w:rPr>
           <w:b/>
           <w:color w:val="0F172A"/>
-          <w:sz w:val="30"/>
+          <w:sz w:val="28"/>
         </w:rPr>
-        <w:t>5. Cara Kerja Metode Terpilih (Bahasa Sederhana)</w:t>
+        <w:t>6. Metode Terpilih — Detail Teknis</w:t>
+      </w:r>
+    </w:p>
+    <w:p>
+      <w:r>
+        <w:t>Ensemble LGBM + Theta = rata-rata sama berat dari ramalan dua model yang bekerja dengan cara sangat beda:</w:t>
       </w:r>
     </w:p>
     <w:p>
@@ -653,7 +1966,7 @@
         <w:rPr>
           <w:sz w:val="21"/>
         </w:rPr>
-        <w:t>pembaca pola modern berbasis pohon keputusan. Ia belajar dari riwayat angka, kalender, dan cuaca, lalu menuangkannya menjadi satu tebakan.</w:t>
+        <w:t>pembaca pola berbasis pohon keputusan (gradient boosting). Masukannya tabel 18 kolom: lag 1–7 hari; rata-rata bergerak 7 &amp; 30 hari; simpangan baku 30 hari; lag 365 hari; sin/cos tahunan (365,25 hari); indikator hari-dalam-minggu; sin/cos mingguan + harmonik ke-2. Parameter: 200 pohon, learning rate 0,05, maks 15 daun, min 20 sampel/daun, benih acak 42, mode determinis (n_jobs=1). Dilatih terpisah per polutan, per jarak (h=1/7/30), per titik awal.</w:t>
       </w:r>
     </w:p>
     <w:p>
@@ -672,7 +1985,7 @@
         <w:rPr>
           <w:sz w:val="21"/>
         </w:rPr>
-        <w:t>metode klasik yang ringan: memecah deret menjadi garis tren dan kurva musiman, lalu meneruskan keduanya ke masa depan.</w:t>
+        <w:t>metode klasik statsmodels: mengurai deret menjadi garis tren (dari dua sudut pandang — theta 0 dan 2) plus musiman mingguan additif (period=7, deseasonalize=True), lalu meneruskan keduanya ke masa depan. Ringan, tanpa pelatihan berat, stabil.</w:t>
       </w:r>
     </w:p>
     <w:p>
@@ -685,18 +1998,18 @@
           <w:b/>
           <w:sz w:val="21"/>
         </w:rPr>
-        <w:t xml:space="preserve">Mengapa dirata-rata: </w:t>
+        <w:t xml:space="preserve">Ensemble: </w:t>
       </w:r>
       <w:r>
         <w:rPr>
           <w:sz w:val="21"/>
         </w:rPr>
-        <w:t>galat keduanya jarang salah ke arah yang sama pada waktu yang sama; dirata-rata, sebagian kesalahan saling menghapus dan hasil akhir lebih stabil.</w:t>
+        <w:t>ŷ(final) = ½ × (ŷ_LGBM + ŷ_Theta). Dua model ini jarang salah ke arah yang sama pada waktu yang sama — LGBM rajin mengejar lonjakan, Theta tenang saat lonjakan palsu — sehingga rata-rata membuat galatnya saling menghapus. Tidak ada parameter tambahan untuk disetel; kombinasi ini murni rata-rata.</w:t>
       </w:r>
     </w:p>
     <w:p>
       <w:r>
-        <w:t>Bentuk akhirnya sederhana: satu rata-rata dari dua keluarga model yang bekerja sangat berbeda (statistik klasik + pembelajaran mesin) — cerita yang mudah dipertahankan di depan penelaah.</w:t>
+        <w:t>Kedua model bekerja murni dari riwayat polutan dan penanda kalender — tanpa masukan eksternal. Seluruh rangkaian latih-uji metode terpilih berjalan penuh pada CPU laptop biasa; ukurannya: bake-off fase 20 lengkap ±17 menit, sedangkan ensemble yang sudah tersimpan meramal hampir instan.</w:t>
       </w:r>
     </w:p>
     <w:p>
@@ -707,14 +2020,14 @@
         <w:rPr>
           <w:b/>
           <w:color w:val="0F172A"/>
-          <w:sz w:val="30"/>
+          <w:sz w:val="28"/>
         </w:rPr>
-        <w:t>6. Hasil Duel melawan Metode Lengkap Paper</w:t>
+        <w:t>7. Hasil Duel melawan Metode Lengkap Paper</w:t>
       </w:r>
     </w:p>
     <w:p>
       <w:r>
-        <w:t>Selisih RMSE ensemble LGBM + Theta terhadap gabungan SARIMA + BiLSTM milik paper. Negatif berarti metode baru lebih baik; bintang berarti selisihnya nyata secara statistik.</w:t>
+        <w:t>Sembilan sel = 3 polutan × 3 jarak. Kolom RMSE pada skala data Box–Cox; 'selisih' = RMSE metode baru relatif metode paper (negatif = lebih baik); p dari uji Diebold–Mariano.</w:t>
       </w:r>
     </w:p>
     <w:tbl>
@@ -732,15 +2045,18 @@
         </w:tblBorders>
       </w:tblPr>
       <w:tblGrid>
-        <w:gridCol w:w="2409"/>
-        <w:gridCol w:w="2409"/>
-        <w:gridCol w:w="2409"/>
-        <w:gridCol w:w="2409"/>
+        <w:gridCol w:w="1377"/>
+        <w:gridCol w:w="1377"/>
+        <w:gridCol w:w="1377"/>
+        <w:gridCol w:w="1377"/>
+        <w:gridCol w:w="1377"/>
+        <w:gridCol w:w="1377"/>
+        <w:gridCol w:w="1377"/>
       </w:tblGrid>
       <w:tr>
         <w:tc>
           <w:tcPr>
-            <w:tcW w:type="dxa" w:w="1474"/>
+            <w:tcW w:type="dxa" w:w="1134"/>
             <w:shd w:fill="0F172A"/>
           </w:tcPr>
           <w:p>
@@ -748,7 +2064,7 @@
               <w:rPr>
                 <w:b/>
                 <w:color w:val="FFFFFF"/>
-                <w:sz w:val="19"/>
+                <w:sz w:val="18"/>
               </w:rPr>
               <w:t>Polutan</w:t>
             </w:r>
@@ -756,7 +2072,7 @@
         </w:tc>
         <w:tc>
           <w:tcPr>
-            <w:tcW w:type="dxa" w:w="1247"/>
+            <w:tcW w:type="dxa" w:w="964"/>
             <w:shd w:fill="0F172A"/>
           </w:tcPr>
           <w:p>
@@ -764,7 +2080,7 @@
               <w:rPr>
                 <w:b/>
                 <w:color w:val="FFFFFF"/>
-                <w:sz w:val="19"/>
+                <w:sz w:val="18"/>
               </w:rPr>
               <w:t>Jarak</w:t>
             </w:r>
@@ -772,7 +2088,7 @@
         </w:tc>
         <w:tc>
           <w:tcPr>
-            <w:tcW w:type="dxa" w:w="1587"/>
+            <w:tcW w:type="dxa" w:w="1304"/>
             <w:shd w:fill="0F172A"/>
           </w:tcPr>
           <w:p>
@@ -780,7 +2096,39 @@
               <w:rPr>
                 <w:b/>
                 <w:color w:val="FFFFFF"/>
-                <w:sz w:val="19"/>
+                <w:sz w:val="18"/>
+              </w:rPr>
+              <w:t>RMSE baru</w:t>
+            </w:r>
+          </w:p>
+        </w:tc>
+        <w:tc>
+          <w:tcPr>
+            <w:tcW w:type="dxa" w:w="1304"/>
+            <w:shd w:fill="0F172A"/>
+          </w:tcPr>
+          <w:p>
+            <w:r>
+              <w:rPr>
+                <w:b/>
+                <w:color w:val="FFFFFF"/>
+                <w:sz w:val="18"/>
+              </w:rPr>
+              <w:t>RMSE paper</w:t>
+            </w:r>
+          </w:p>
+        </w:tc>
+        <w:tc>
+          <w:tcPr>
+            <w:tcW w:type="dxa" w:w="1191"/>
+            <w:shd w:fill="0F172A"/>
+          </w:tcPr>
+          <w:p>
+            <w:r>
+              <w:rPr>
+                <w:b/>
+                <w:color w:val="FFFFFF"/>
+                <w:sz w:val="18"/>
               </w:rPr>
               <w:t>Selisih</w:t>
             </w:r>
@@ -788,7 +2136,7 @@
         </w:tc>
         <w:tc>
           <w:tcPr>
-            <w:tcW w:type="dxa" w:w="5216"/>
+            <w:tcW w:type="dxa" w:w="1134"/>
             <w:shd w:fill="0F172A"/>
           </w:tcPr>
           <w:p>
@@ -796,7 +2144,23 @@
               <w:rPr>
                 <w:b/>
                 <w:color w:val="FFFFFF"/>
-                <w:sz w:val="19"/>
+                <w:sz w:val="18"/>
+              </w:rPr>
+              <w:t>p (DM)</w:t>
+            </w:r>
+          </w:p>
+        </w:tc>
+        <w:tc>
+          <w:tcPr>
+            <w:tcW w:type="dxa" w:w="2494"/>
+            <w:shd w:fill="0F172A"/>
+          </w:tcPr>
+          <w:p>
+            <w:r>
+              <w:rPr>
+                <w:b/>
+                <w:color w:val="FFFFFF"/>
+                <w:sz w:val="18"/>
               </w:rPr>
               <w:t>Status</w:t>
             </w:r>
@@ -806,12 +2170,12 @@
       <w:tr>
         <w:tc>
           <w:tcPr>
-            <w:tcW w:type="dxa" w:w="1474"/>
+            <w:tcW w:type="dxa" w:w="1134"/>
           </w:tcPr>
           <w:p>
             <w:r>
               <w:rPr>
-                <w:sz w:val="19"/>
+                <w:sz w:val="18"/>
               </w:rPr>
               <w:t>NO2</w:t>
             </w:r>
@@ -819,12 +2183,12 @@
         </w:tc>
         <w:tc>
           <w:tcPr>
-            <w:tcW w:type="dxa" w:w="1247"/>
+            <w:tcW w:type="dxa" w:w="964"/>
           </w:tcPr>
           <w:p>
             <w:r>
               <w:rPr>
-                <w:sz w:val="19"/>
+                <w:sz w:val="18"/>
               </w:rPr>
               <w:t>1 hari</w:t>
             </w:r>
@@ -832,27 +2196,66 @@
         </w:tc>
         <w:tc>
           <w:tcPr>
-            <w:tcW w:type="dxa" w:w="1587"/>
+            <w:tcW w:type="dxa" w:w="1304"/>
           </w:tcPr>
           <w:p>
             <w:r>
               <w:rPr>
-                <w:sz w:val="19"/>
+                <w:sz w:val="18"/>
               </w:rPr>
-              <w:t>+10,5%</w:t>
+              <w:t>0,736</w:t>
             </w:r>
           </w:p>
         </w:tc>
         <w:tc>
           <w:tcPr>
-            <w:tcW w:type="dxa" w:w="5216"/>
+            <w:tcW w:type="dxa" w:w="1304"/>
           </w:tcPr>
           <w:p>
             <w:r>
               <w:rPr>
-                <w:sz w:val="19"/>
+                <w:sz w:val="18"/>
               </w:rPr>
-              <w:t>kalah, tidak nyata (p=0,054)</w:t>
+              <w:t>0,667</w:t>
+            </w:r>
+          </w:p>
+        </w:tc>
+        <w:tc>
+          <w:tcPr>
+            <w:tcW w:type="dxa" w:w="1191"/>
+          </w:tcPr>
+          <w:p>
+            <w:r>
+              <w:rPr>
+                <w:sz w:val="18"/>
+              </w:rPr>
+              <w:t>+10,4%</w:t>
+            </w:r>
+          </w:p>
+        </w:tc>
+        <w:tc>
+          <w:tcPr>
+            <w:tcW w:type="dxa" w:w="1134"/>
+          </w:tcPr>
+          <w:p>
+            <w:r>
+              <w:rPr>
+                <w:sz w:val="18"/>
+              </w:rPr>
+              <w:t>0,054</w:t>
+            </w:r>
+          </w:p>
+        </w:tc>
+        <w:tc>
+          <w:tcPr>
+            <w:tcW w:type="dxa" w:w="2494"/>
+          </w:tcPr>
+          <w:p>
+            <w:r>
+              <w:rPr>
+                <w:sz w:val="18"/>
+              </w:rPr>
+              <w:t>kalah (tidak nyata)</w:t>
             </w:r>
           </w:p>
         </w:tc>
@@ -860,13 +2263,13 @@
       <w:tr>
         <w:tc>
           <w:tcPr>
-            <w:tcW w:type="dxa" w:w="1474"/>
+            <w:tcW w:type="dxa" w:w="1134"/>
             <w:shd w:fill="F3F4F6"/>
           </w:tcPr>
           <w:p>
             <w:r>
               <w:rPr>
-                <w:sz w:val="19"/>
+                <w:sz w:val="18"/>
               </w:rPr>
               <w:t>NO2</w:t>
             </w:r>
@@ -874,13 +2277,13 @@
         </w:tc>
         <w:tc>
           <w:tcPr>
-            <w:tcW w:type="dxa" w:w="1247"/>
+            <w:tcW w:type="dxa" w:w="964"/>
             <w:shd w:fill="F3F4F6"/>
           </w:tcPr>
           <w:p>
             <w:r>
               <w:rPr>
-                <w:sz w:val="19"/>
+                <w:sz w:val="18"/>
               </w:rPr>
               <w:t>7 hari</w:t>
             </w:r>
@@ -888,13 +2291,41 @@
         </w:tc>
         <w:tc>
           <w:tcPr>
-            <w:tcW w:type="dxa" w:w="1587"/>
+            <w:tcW w:type="dxa" w:w="1304"/>
             <w:shd w:fill="F3F4F6"/>
           </w:tcPr>
           <w:p>
             <w:r>
               <w:rPr>
-                <w:sz w:val="19"/>
+                <w:sz w:val="18"/>
+              </w:rPr>
+              <w:t>0,965</w:t>
+            </w:r>
+          </w:p>
+        </w:tc>
+        <w:tc>
+          <w:tcPr>
+            <w:tcW w:type="dxa" w:w="1304"/>
+            <w:shd w:fill="F3F4F6"/>
+          </w:tcPr>
+          <w:p>
+            <w:r>
+              <w:rPr>
+                <w:sz w:val="18"/>
+              </w:rPr>
+              <w:t>0,933</w:t>
+            </w:r>
+          </w:p>
+        </w:tc>
+        <w:tc>
+          <w:tcPr>
+            <w:tcW w:type="dxa" w:w="1191"/>
+            <w:shd w:fill="F3F4F6"/>
+          </w:tcPr>
+          <w:p>
+            <w:r>
+              <w:rPr>
+                <w:sz w:val="18"/>
               </w:rPr>
               <w:t>+3,0%</w:t>
             </w:r>
@@ -902,15 +2333,29 @@
         </w:tc>
         <w:tc>
           <w:tcPr>
-            <w:tcW w:type="dxa" w:w="5216"/>
+            <w:tcW w:type="dxa" w:w="1134"/>
             <w:shd w:fill="F3F4F6"/>
           </w:tcPr>
           <w:p>
             <w:r>
               <w:rPr>
-                <w:sz w:val="19"/>
+                <w:sz w:val="18"/>
               </w:rPr>
-              <w:t>kalah, tidak nyata (p=0,218)</w:t>
+              <w:t>0,218</w:t>
+            </w:r>
+          </w:p>
+        </w:tc>
+        <w:tc>
+          <w:tcPr>
+            <w:tcW w:type="dxa" w:w="2494"/>
+            <w:shd w:fill="F3F4F6"/>
+          </w:tcPr>
+          <w:p>
+            <w:r>
+              <w:rPr>
+                <w:sz w:val="18"/>
+              </w:rPr>
+              <w:t>kalah (tidak nyata)</w:t>
             </w:r>
           </w:p>
         </w:tc>
@@ -918,12 +2363,12 @@
       <w:tr>
         <w:tc>
           <w:tcPr>
-            <w:tcW w:type="dxa" w:w="1474"/>
+            <w:tcW w:type="dxa" w:w="1134"/>
           </w:tcPr>
           <w:p>
             <w:r>
               <w:rPr>
-                <w:sz w:val="19"/>
+                <w:sz w:val="18"/>
               </w:rPr>
               <w:t>NO2</w:t>
             </w:r>
@@ -931,12 +2376,12 @@
         </w:tc>
         <w:tc>
           <w:tcPr>
-            <w:tcW w:type="dxa" w:w="1247"/>
+            <w:tcW w:type="dxa" w:w="964"/>
           </w:tcPr>
           <w:p>
             <w:r>
               <w:rPr>
-                <w:sz w:val="19"/>
+                <w:sz w:val="18"/>
               </w:rPr>
               <w:t>30 hari</w:t>
             </w:r>
@@ -944,12 +2389,38 @@
         </w:tc>
         <w:tc>
           <w:tcPr>
-            <w:tcW w:type="dxa" w:w="1587"/>
+            <w:tcW w:type="dxa" w:w="1304"/>
           </w:tcPr>
           <w:p>
             <w:r>
               <w:rPr>
-                <w:sz w:val="19"/>
+                <w:sz w:val="18"/>
+              </w:rPr>
+              <w:t>0,699</w:t>
+            </w:r>
+          </w:p>
+        </w:tc>
+        <w:tc>
+          <w:tcPr>
+            <w:tcW w:type="dxa" w:w="1304"/>
+          </w:tcPr>
+          <w:p>
+            <w:r>
+              <w:rPr>
+                <w:sz w:val="18"/>
+              </w:rPr>
+              <w:t>0,748</w:t>
+            </w:r>
+          </w:p>
+        </w:tc>
+        <w:tc>
+          <w:tcPr>
+            <w:tcW w:type="dxa" w:w="1191"/>
+          </w:tcPr>
+          <w:p>
+            <w:r>
+              <w:rPr>
+                <w:sz w:val="18"/>
               </w:rPr>
               <w:t>−6,8%</w:t>
             </w:r>
@@ -957,14 +2428,27 @@
         </w:tc>
         <w:tc>
           <w:tcPr>
-            <w:tcW w:type="dxa" w:w="5216"/>
+            <w:tcW w:type="dxa" w:w="1134"/>
           </w:tcPr>
           <w:p>
             <w:r>
               <w:rPr>
-                <w:sz w:val="19"/>
+                <w:sz w:val="18"/>
               </w:rPr>
-              <w:t>MENANG nyata (p&lt;0,001)</w:t>
+              <w:t>&lt;0,001</w:t>
+            </w:r>
+          </w:p>
+        </w:tc>
+        <w:tc>
+          <w:tcPr>
+            <w:tcW w:type="dxa" w:w="2494"/>
+          </w:tcPr>
+          <w:p>
+            <w:r>
+              <w:rPr>
+                <w:sz w:val="18"/>
+              </w:rPr>
+              <w:t>MENANG nyata</w:t>
             </w:r>
           </w:p>
         </w:tc>
@@ -972,13 +2456,13 @@
       <w:tr>
         <w:tc>
           <w:tcPr>
-            <w:tcW w:type="dxa" w:w="1474"/>
+            <w:tcW w:type="dxa" w:w="1134"/>
             <w:shd w:fill="F3F4F6"/>
           </w:tcPr>
           <w:p>
             <w:r>
               <w:rPr>
-                <w:sz w:val="19"/>
+                <w:sz w:val="18"/>
               </w:rPr>
               <w:t>PM10</w:t>
             </w:r>
@@ -986,13 +2470,13 @@
         </w:tc>
         <w:tc>
           <w:tcPr>
-            <w:tcW w:type="dxa" w:w="1247"/>
+            <w:tcW w:type="dxa" w:w="964"/>
             <w:shd w:fill="F3F4F6"/>
           </w:tcPr>
           <w:p>
             <w:r>
               <w:rPr>
-                <w:sz w:val="19"/>
+                <w:sz w:val="18"/>
               </w:rPr>
               <w:t>1 hari</w:t>
             </w:r>
@@ -1000,13 +2484,41 @@
         </w:tc>
         <w:tc>
           <w:tcPr>
-            <w:tcW w:type="dxa" w:w="1587"/>
+            <w:tcW w:type="dxa" w:w="1304"/>
             <w:shd w:fill="F3F4F6"/>
           </w:tcPr>
           <w:p>
             <w:r>
               <w:rPr>
-                <w:sz w:val="19"/>
+                <w:sz w:val="18"/>
+              </w:rPr>
+              <w:t>0,107</w:t>
+            </w:r>
+          </w:p>
+        </w:tc>
+        <w:tc>
+          <w:tcPr>
+            <w:tcW w:type="dxa" w:w="1304"/>
+            <w:shd w:fill="F3F4F6"/>
+          </w:tcPr>
+          <w:p>
+            <w:r>
+              <w:rPr>
+                <w:sz w:val="18"/>
+              </w:rPr>
+              <w:t>0,119</w:t>
+            </w:r>
+          </w:p>
+        </w:tc>
+        <w:tc>
+          <w:tcPr>
+            <w:tcW w:type="dxa" w:w="1191"/>
+            <w:shd w:fill="F3F4F6"/>
+          </w:tcPr>
+          <w:p>
+            <w:r>
+              <w:rPr>
+                <w:sz w:val="18"/>
               </w:rPr>
               <w:t>−10,6%</w:t>
             </w:r>
@@ -1014,15 +2526,29 @@
         </w:tc>
         <w:tc>
           <w:tcPr>
-            <w:tcW w:type="dxa" w:w="5216"/>
+            <w:tcW w:type="dxa" w:w="1134"/>
             <w:shd w:fill="F3F4F6"/>
           </w:tcPr>
           <w:p>
             <w:r>
               <w:rPr>
-                <w:sz w:val="19"/>
+                <w:sz w:val="18"/>
               </w:rPr>
-              <w:t>MENANG nyata (p=0,014)</w:t>
+              <w:t>0,014</w:t>
+            </w:r>
+          </w:p>
+        </w:tc>
+        <w:tc>
+          <w:tcPr>
+            <w:tcW w:type="dxa" w:w="2494"/>
+            <w:shd w:fill="F3F4F6"/>
+          </w:tcPr>
+          <w:p>
+            <w:r>
+              <w:rPr>
+                <w:sz w:val="18"/>
+              </w:rPr>
+              <w:t>MENANG nyata</w:t>
             </w:r>
           </w:p>
         </w:tc>
@@ -1030,12 +2556,12 @@
       <w:tr>
         <w:tc>
           <w:tcPr>
-            <w:tcW w:type="dxa" w:w="1474"/>
+            <w:tcW w:type="dxa" w:w="1134"/>
           </w:tcPr>
           <w:p>
             <w:r>
               <w:rPr>
-                <w:sz w:val="19"/>
+                <w:sz w:val="18"/>
               </w:rPr>
               <w:t>PM10</w:t>
             </w:r>
@@ -1043,12 +2569,12 @@
         </w:tc>
         <w:tc>
           <w:tcPr>
-            <w:tcW w:type="dxa" w:w="1247"/>
+            <w:tcW w:type="dxa" w:w="964"/>
           </w:tcPr>
           <w:p>
             <w:r>
               <w:rPr>
-                <w:sz w:val="19"/>
+                <w:sz w:val="18"/>
               </w:rPr>
               <w:t>7 hari</w:t>
             </w:r>
@@ -1056,12 +2582,38 @@
         </w:tc>
         <w:tc>
           <w:tcPr>
-            <w:tcW w:type="dxa" w:w="1587"/>
+            <w:tcW w:type="dxa" w:w="1304"/>
           </w:tcPr>
           <w:p>
             <w:r>
               <w:rPr>
-                <w:sz w:val="19"/>
+                <w:sz w:val="18"/>
+              </w:rPr>
+              <w:t>0,139</w:t>
+            </w:r>
+          </w:p>
+        </w:tc>
+        <w:tc>
+          <w:tcPr>
+            <w:tcW w:type="dxa" w:w="1304"/>
+          </w:tcPr>
+          <w:p>
+            <w:r>
+              <w:rPr>
+                <w:sz w:val="18"/>
+              </w:rPr>
+              <w:t>0,154</w:t>
+            </w:r>
+          </w:p>
+        </w:tc>
+        <w:tc>
+          <w:tcPr>
+            <w:tcW w:type="dxa" w:w="1191"/>
+          </w:tcPr>
+          <w:p>
+            <w:r>
+              <w:rPr>
+                <w:sz w:val="18"/>
               </w:rPr>
               <w:t>−9,5%</w:t>
             </w:r>
@@ -1069,14 +2621,27 @@
         </w:tc>
         <w:tc>
           <w:tcPr>
-            <w:tcW w:type="dxa" w:w="5216"/>
+            <w:tcW w:type="dxa" w:w="1134"/>
           </w:tcPr>
           <w:p>
             <w:r>
               <w:rPr>
-                <w:sz w:val="19"/>
+                <w:sz w:val="18"/>
               </w:rPr>
-              <w:t>MENANG nyata (p=0,030)</w:t>
+              <w:t>0,029</w:t>
+            </w:r>
+          </w:p>
+        </w:tc>
+        <w:tc>
+          <w:tcPr>
+            <w:tcW w:type="dxa" w:w="2494"/>
+          </w:tcPr>
+          <w:p>
+            <w:r>
+              <w:rPr>
+                <w:sz w:val="18"/>
+              </w:rPr>
+              <w:t>MENANG nyata</w:t>
             </w:r>
           </w:p>
         </w:tc>
@@ -1084,13 +2649,13 @@
       <w:tr>
         <w:tc>
           <w:tcPr>
-            <w:tcW w:type="dxa" w:w="1474"/>
+            <w:tcW w:type="dxa" w:w="1134"/>
             <w:shd w:fill="F3F4F6"/>
           </w:tcPr>
           <w:p>
             <w:r>
               <w:rPr>
-                <w:sz w:val="19"/>
+                <w:sz w:val="18"/>
               </w:rPr>
               <w:t>PM10</w:t>
             </w:r>
@@ -1098,13 +2663,13 @@
         </w:tc>
         <w:tc>
           <w:tcPr>
-            <w:tcW w:type="dxa" w:w="1247"/>
+            <w:tcW w:type="dxa" w:w="964"/>
             <w:shd w:fill="F3F4F6"/>
           </w:tcPr>
           <w:p>
             <w:r>
               <w:rPr>
-                <w:sz w:val="19"/>
+                <w:sz w:val="18"/>
               </w:rPr>
               <w:t>30 hari</w:t>
             </w:r>
@@ -1112,13 +2677,41 @@
         </w:tc>
         <w:tc>
           <w:tcPr>
-            <w:tcW w:type="dxa" w:w="1587"/>
+            <w:tcW w:type="dxa" w:w="1304"/>
             <w:shd w:fill="F3F4F6"/>
           </w:tcPr>
           <w:p>
             <w:r>
               <w:rPr>
-                <w:sz w:val="19"/>
+                <w:sz w:val="18"/>
+              </w:rPr>
+              <w:t>0,138</w:t>
+            </w:r>
+          </w:p>
+        </w:tc>
+        <w:tc>
+          <w:tcPr>
+            <w:tcW w:type="dxa" w:w="1304"/>
+            <w:shd w:fill="F3F4F6"/>
+          </w:tcPr>
+          <w:p>
+            <w:r>
+              <w:rPr>
+                <w:sz w:val="18"/>
+              </w:rPr>
+              <w:t>0,153</w:t>
+            </w:r>
+          </w:p>
+        </w:tc>
+        <w:tc>
+          <w:tcPr>
+            <w:tcW w:type="dxa" w:w="1191"/>
+            <w:shd w:fill="F3F4F6"/>
+          </w:tcPr>
+          <w:p>
+            <w:r>
+              <w:rPr>
+                <w:sz w:val="18"/>
               </w:rPr>
               <w:t>−10,1%</w:t>
             </w:r>
@@ -1126,15 +2719,29 @@
         </w:tc>
         <w:tc>
           <w:tcPr>
-            <w:tcW w:type="dxa" w:w="5216"/>
+            <w:tcW w:type="dxa" w:w="1134"/>
             <w:shd w:fill="F3F4F6"/>
           </w:tcPr>
           <w:p>
             <w:r>
               <w:rPr>
-                <w:sz w:val="19"/>
+                <w:sz w:val="18"/>
               </w:rPr>
-              <w:t>MENANG nyata (p&lt;0,001)</w:t>
+              <w:t>&lt;0,001</w:t>
+            </w:r>
+          </w:p>
+        </w:tc>
+        <w:tc>
+          <w:tcPr>
+            <w:tcW w:type="dxa" w:w="2494"/>
+            <w:shd w:fill="F3F4F6"/>
+          </w:tcPr>
+          <w:p>
+            <w:r>
+              <w:rPr>
+                <w:sz w:val="18"/>
+              </w:rPr>
+              <w:t>MENANG nyata</w:t>
             </w:r>
           </w:p>
         </w:tc>
@@ -1142,25 +2749,25 @@
       <w:tr>
         <w:tc>
           <w:tcPr>
-            <w:tcW w:type="dxa" w:w="1474"/>
+            <w:tcW w:type="dxa" w:w="1134"/>
           </w:tcPr>
           <w:p>
             <w:r>
               <w:rPr>
-                <w:sz w:val="19"/>
+                <w:sz w:val="18"/>
               </w:rPr>
-              <w:t>PM2.5</w:t>
+              <w:t>PM25</w:t>
             </w:r>
           </w:p>
         </w:tc>
         <w:tc>
           <w:tcPr>
-            <w:tcW w:type="dxa" w:w="1247"/>
+            <w:tcW w:type="dxa" w:w="964"/>
           </w:tcPr>
           <w:p>
             <w:r>
               <w:rPr>
-                <w:sz w:val="19"/>
+                <w:sz w:val="18"/>
               </w:rPr>
               <w:t>1 hari</w:t>
             </w:r>
@@ -1168,12 +2775,38 @@
         </w:tc>
         <w:tc>
           <w:tcPr>
-            <w:tcW w:type="dxa" w:w="1587"/>
+            <w:tcW w:type="dxa" w:w="1304"/>
           </w:tcPr>
           <w:p>
             <w:r>
               <w:rPr>
-                <w:sz w:val="19"/>
+                <w:sz w:val="18"/>
+              </w:rPr>
+              <w:t>0,062</w:t>
+            </w:r>
+          </w:p>
+        </w:tc>
+        <w:tc>
+          <w:tcPr>
+            <w:tcW w:type="dxa" w:w="1304"/>
+          </w:tcPr>
+          <w:p>
+            <w:r>
+              <w:rPr>
+                <w:sz w:val="18"/>
+              </w:rPr>
+              <w:t>0,065</w:t>
+            </w:r>
+          </w:p>
+        </w:tc>
+        <w:tc>
+          <w:tcPr>
+            <w:tcW w:type="dxa" w:w="1191"/>
+          </w:tcPr>
+          <w:p>
+            <w:r>
+              <w:rPr>
+                <w:sz w:val="18"/>
               </w:rPr>
               <w:t>−5,6%</w:t>
             </w:r>
@@ -1181,14 +2814,27 @@
         </w:tc>
         <w:tc>
           <w:tcPr>
-            <w:tcW w:type="dxa" w:w="5216"/>
+            <w:tcW w:type="dxa" w:w="1134"/>
           </w:tcPr>
           <w:p>
             <w:r>
               <w:rPr>
-                <w:sz w:val="19"/>
+                <w:sz w:val="18"/>
               </w:rPr>
-              <w:t>menang, tidak nyata (p=0,060)</w:t>
+              <w:t>0,059</w:t>
+            </w:r>
+          </w:p>
+        </w:tc>
+        <w:tc>
+          <w:tcPr>
+            <w:tcW w:type="dxa" w:w="2494"/>
+          </w:tcPr>
+          <w:p>
+            <w:r>
+              <w:rPr>
+                <w:sz w:val="18"/>
+              </w:rPr>
+              <w:t>menang (tidak nyata)</w:t>
             </w:r>
           </w:p>
         </w:tc>
@@ -1196,27 +2842,27 @@
       <w:tr>
         <w:tc>
           <w:tcPr>
-            <w:tcW w:type="dxa" w:w="1474"/>
+            <w:tcW w:type="dxa" w:w="1134"/>
             <w:shd w:fill="F3F4F6"/>
           </w:tcPr>
           <w:p>
             <w:r>
               <w:rPr>
-                <w:sz w:val="19"/>
+                <w:sz w:val="18"/>
               </w:rPr>
-              <w:t>PM2.5</w:t>
+              <w:t>PM25</w:t>
             </w:r>
           </w:p>
         </w:tc>
         <w:tc>
           <w:tcPr>
-            <w:tcW w:type="dxa" w:w="1247"/>
+            <w:tcW w:type="dxa" w:w="964"/>
             <w:shd w:fill="F3F4F6"/>
           </w:tcPr>
           <w:p>
             <w:r>
               <w:rPr>
-                <w:sz w:val="19"/>
+                <w:sz w:val="18"/>
               </w:rPr>
               <w:t>7 hari</w:t>
             </w:r>
@@ -1224,13 +2870,41 @@
         </w:tc>
         <w:tc>
           <w:tcPr>
-            <w:tcW w:type="dxa" w:w="1587"/>
+            <w:tcW w:type="dxa" w:w="1304"/>
             <w:shd w:fill="F3F4F6"/>
           </w:tcPr>
           <w:p>
             <w:r>
               <w:rPr>
-                <w:sz w:val="19"/>
+                <w:sz w:val="18"/>
+              </w:rPr>
+              <w:t>0,073</w:t>
+            </w:r>
+          </w:p>
+        </w:tc>
+        <w:tc>
+          <w:tcPr>
+            <w:tcW w:type="dxa" w:w="1304"/>
+            <w:shd w:fill="F3F4F6"/>
+          </w:tcPr>
+          <w:p>
+            <w:r>
+              <w:rPr>
+                <w:sz w:val="18"/>
+              </w:rPr>
+              <w:t>0,074</w:t>
+            </w:r>
+          </w:p>
+        </w:tc>
+        <w:tc>
+          <w:tcPr>
+            <w:tcW w:type="dxa" w:w="1191"/>
+            <w:shd w:fill="F3F4F6"/>
+          </w:tcPr>
+          <w:p>
+            <w:r>
+              <w:rPr>
+                <w:sz w:val="18"/>
               </w:rPr>
               <w:t>−1,7%</w:t>
             </w:r>
@@ -1238,15 +2912,29 @@
         </w:tc>
         <w:tc>
           <w:tcPr>
-            <w:tcW w:type="dxa" w:w="5216"/>
+            <w:tcW w:type="dxa" w:w="1134"/>
             <w:shd w:fill="F3F4F6"/>
           </w:tcPr>
           <w:p>
             <w:r>
               <w:rPr>
-                <w:sz w:val="19"/>
+                <w:sz w:val="18"/>
               </w:rPr>
-              <w:t>menang, tidak nyata (p=0,661)</w:t>
+              <w:t>0,661</w:t>
+            </w:r>
+          </w:p>
+        </w:tc>
+        <w:tc>
+          <w:tcPr>
+            <w:tcW w:type="dxa" w:w="2494"/>
+            <w:shd w:fill="F3F4F6"/>
+          </w:tcPr>
+          <w:p>
+            <w:r>
+              <w:rPr>
+                <w:sz w:val="18"/>
+              </w:rPr>
+              <w:t>menang (tidak nyata)</w:t>
             </w:r>
           </w:p>
         </w:tc>
@@ -1254,25 +2942,25 @@
       <w:tr>
         <w:tc>
           <w:tcPr>
-            <w:tcW w:type="dxa" w:w="1474"/>
+            <w:tcW w:type="dxa" w:w="1134"/>
           </w:tcPr>
           <w:p>
             <w:r>
               <w:rPr>
-                <w:sz w:val="19"/>
+                <w:sz w:val="18"/>
               </w:rPr>
-              <w:t>PM2.5</w:t>
+              <w:t>PM25</w:t>
             </w:r>
           </w:p>
         </w:tc>
         <w:tc>
           <w:tcPr>
-            <w:tcW w:type="dxa" w:w="1247"/>
+            <w:tcW w:type="dxa" w:w="964"/>
           </w:tcPr>
           <w:p>
             <w:r>
               <w:rPr>
-                <w:sz w:val="19"/>
+                <w:sz w:val="18"/>
               </w:rPr>
               <w:t>30 hari</w:t>
             </w:r>
@@ -1280,12 +2968,38 @@
         </w:tc>
         <w:tc>
           <w:tcPr>
-            <w:tcW w:type="dxa" w:w="1587"/>
+            <w:tcW w:type="dxa" w:w="1304"/>
           </w:tcPr>
           <w:p>
             <w:r>
               <w:rPr>
-                <w:sz w:val="19"/>
+                <w:sz w:val="18"/>
+              </w:rPr>
+              <w:t>0,073</w:t>
+            </w:r>
+          </w:p>
+        </w:tc>
+        <w:tc>
+          <w:tcPr>
+            <w:tcW w:type="dxa" w:w="1304"/>
+          </w:tcPr>
+          <w:p>
+            <w:r>
+              <w:rPr>
+                <w:sz w:val="18"/>
+              </w:rPr>
+              <w:t>0,090</w:t>
+            </w:r>
+          </w:p>
+        </w:tc>
+        <w:tc>
+          <w:tcPr>
+            <w:tcW w:type="dxa" w:w="1191"/>
+          </w:tcPr>
+          <w:p>
+            <w:r>
+              <w:rPr>
+                <w:sz w:val="18"/>
               </w:rPr>
               <w:t>−20,1%</w:t>
             </w:r>
@@ -1293,14 +3007,27 @@
         </w:tc>
         <w:tc>
           <w:tcPr>
-            <w:tcW w:type="dxa" w:w="5216"/>
+            <w:tcW w:type="dxa" w:w="1134"/>
           </w:tcPr>
           <w:p>
             <w:r>
               <w:rPr>
-                <w:sz w:val="19"/>
+                <w:sz w:val="18"/>
               </w:rPr>
-              <w:t>MENANG nyata (p&lt;0,001)</w:t>
+              <w:t>&lt;0,001</w:t>
+            </w:r>
+          </w:p>
+        </w:tc>
+        <w:tc>
+          <w:tcPr>
+            <w:tcW w:type="dxa" w:w="2494"/>
+          </w:tcPr>
+          <w:p>
+            <w:r>
+              <w:rPr>
+                <w:sz w:val="18"/>
+              </w:rPr>
+              <w:t>MENANG nyata</w:t>
             </w:r>
           </w:p>
         </w:tc>
@@ -1360,7 +3087,7 @@
           <w:color w:val="475569"/>
           <w:sz w:val="17"/>
         </w:rPr>
-        <w:t>Gambar 1. RMSE per sel: metode baru (biru tua) vs metode paper (oranye) dan SARIMA (abu-abu).</w:t>
+        <w:t>Gambar 1. RMSE per sel — metode baru (biru tua) vs metode lengkap paper (oranye) vs SARIMA mingguan (abu-abu).</w:t>
       </w:r>
     </w:p>
     <w:p>
@@ -1412,7 +3139,7 @@
           <w:color w:val="475569"/>
           <w:sz w:val="17"/>
         </w:rPr>
-        <w:t>Gambar 2. Selisih RMSE (%) metode baru vs metode lengkap paper; penanda nyata dari uji DM.</w:t>
+        <w:t>Gambar 2. Selisih RMSE (%) lawan metode lengkap paper; penanda penting dari uji DM (* p&lt;0,05, ** p&lt;0,01).</w:t>
       </w:r>
     </w:p>
     <w:p>
@@ -1464,12 +3191,12 @@
           <w:color w:val="475569"/>
           <w:sz w:val="17"/>
         </w:rPr>
-        <w:t>Gambar 3. Contoh ramalan PM2.5 jarak 30 hari: garis biru tua (metode baru) mengikuti kenyataan lebih rapat.</w:t>
+        <w:t>Gambar 3. Contoh ramalan PM2.5 jarak 30 hari — metode baru mengikuti kenyataan lebih rapat di lonjakan.</w:t>
       </w:r>
     </w:p>
     <w:p>
       <w:r>
-        <w:t>Dari sisi mesin: seluruh eksperimen berjalan di CPU laptop tanpa GPU; pembandingnya, BiLSTM milik paper memakan sekitar 247 detik per lipatan pada replikasi kami. Metode baru jauh lebih murah dan jauh lebih cepat.</w:t>
+        <w:t>Perbandingan beban mesin keduanya menarik: BiLSTM milik paper membawa 544.513 parameter dan dilatih 247,3 detik per lipatan pada GPU T4 (belum mencakup percobaan penalaan); sementara metode baru — dua model ringan — dilatih penuh di CPU laptop dan keseluruhan lomba fase 20 (17 lengan × protokol penuh) hanya 17 menit. Untuk mata kuliah Algorithms &amp; Complexity, perbandingan biaya-hitung vs keakuratan ini adalah temuan inti: metode yang lebih sederhana menang akurasi sekaligus murah di komputasi.</w:t>
       </w:r>
     </w:p>
     <w:p>
@@ -1480,9 +3207,9 @@
         <w:rPr>
           <w:b/>
           <w:color w:val="0F172A"/>
-          <w:sz w:val="30"/>
+          <w:sz w:val="28"/>
         </w:rPr>
-        <w:t>7. Kejujuran Ilmiah — yang Harus Diakui</w:t>
+        <w:t>8. Analisis — Kenapa Metode Ini Menang</w:t>
       </w:r>
     </w:p>
     <w:p>
@@ -1495,13 +3222,32 @@
           <w:b/>
           <w:sz w:val="21"/>
         </w:rPr>
-        <w:t xml:space="preserve">Kelemahan NO2 jarak dekat: </w:t>
+        <w:t xml:space="preserve">PM: </w:t>
       </w:r>
       <w:r>
         <w:rPr>
           <w:sz w:val="21"/>
         </w:rPr>
-        <w:t>dua sel NO2 jarak dekat (1 dan 7 hari) masih milik SARIMA — kalah kecil dan tidak nyata, tetapi tetap kalah. Ini akan ditulis jujur di bagian pembatasan naskah.</w:t>
+        <w:t>partikulat (PM10, PM2.5) dipolakan oleh ritme musiman jangka panjang yang mudah ditangkap kombinasi lag panjang + penanda tahunan; menang 5 dari 6 selnya, 4 di antaranya nyata, sel terbaik −20,1%.</w:t>
+      </w:r>
+    </w:p>
+    <w:p>
+      <w:pPr>
+        <w:pStyle w:val="ListBullet"/>
+        <w:spacing w:after="60"/>
+      </w:pPr>
+      <w:r>
+        <w:rPr>
+          <w:b/>
+          <w:sz w:val="21"/>
+        </w:rPr>
+        <w:t xml:space="preserve">NO2: </w:t>
+      </w:r>
+      <w:r>
+        <w:rPr>
+          <w:sz w:val="21"/>
+        </w:rPr>
+        <w:t>NO2 digerakkan ritme mingguan yang ketat; dua sel jarak dekatnya masih lebih baik dipegang SARIMA musiman mingguan (kalah +10,5% dan +3,0%, keduanya tidak nyata). Pada jarak 30 hari, metode baru justru menang nyata (−6,8%).</w:t>
       </w:r>
     </w:p>
     <w:p>
@@ -1520,20 +3266,7 @@
         <w:rPr>
           <w:sz w:val="21"/>
         </w:rPr>
-        <w:t>menempel gelombang mingguan sebagai fitur tambahan (fase 20) tidak menolong; musiman mingguan NO2 tampaknya butuh struktur model seperti SARIMA — poin analisis menarik untuk bab pembahasan.</w:t>
-      </w:r>
-    </w:p>
-    <w:p>
-      <w:pPr>
-        <w:spacing w:before="280" w:after="80"/>
-      </w:pPr>
-      <w:r>
-        <w:rPr>
-          <w:b/>
-          <w:color w:val="0F172A"/>
-          <w:sz w:val="30"/>
-        </w:rPr>
-        <w:t>8. Status dan Langkah Berikutnya</w:t>
+        <w:t>menempel gelombang mingguan sebagai FITUR LGBM (varian lgbm_mingguan, skor −1,96%) tidak menolong NO2 jarak dekat — bukti empiris bahwa musiman mingguan NO2 membutuhkan komponen musiman eksplisit khas SARIMA, bukan sekadar fitur tambahan. Ini temuan analisis siap kutip di bab pembahasan naskah.</w:t>
       </w:r>
     </w:p>
     <w:p>
@@ -1546,13 +3279,26 @@
           <w:b/>
           <w:sz w:val="21"/>
         </w:rPr>
-        <w:t xml:space="preserve">Keputusan: </w:t>
+        <w:t xml:space="preserve">Efek ensemble: </w:t>
       </w:r>
       <w:r>
         <w:rPr>
           <w:sz w:val="21"/>
         </w:rPr>
-        <w:t>metode dikunci untuk naskah; bab metode mulai ditulis dengan satu metode pengganti.</w:t>
+        <w:t>Theta sendirian lebih buruk (+2,63%) dan LGBM sendirian −2,27%; dirata-rata keduanya −5,46%. Inilah inti logika ensemble: keberagaman gaya salah yang saling meniadakan.</w:t>
+      </w:r>
+    </w:p>
+    <w:p>
+      <w:pPr>
+        <w:spacing w:before="280" w:after="80"/>
+      </w:pPr>
+      <w:r>
+        <w:rPr>
+          <w:b/>
+          <w:color w:val="0F172A"/>
+          <w:sz w:val="28"/>
+        </w:rPr>
+        <w:t>9. Kejujuran Ilmiah — Pembatasan</w:t>
       </w:r>
     </w:p>
     <w:p>
@@ -1565,13 +3311,210 @@
           <w:b/>
           <w:sz w:val="21"/>
         </w:rPr>
-        <w:t xml:space="preserve">Menunggu izin: </w:t>
+        <w:t xml:space="preserve">NO2 jarak dekat: </w:t>
       </w:r>
       <w:r>
         <w:rPr>
           <w:sz w:val="21"/>
         </w:rPr>
-        <w:t>artefak fase 18–20 (skrip, hasil, gambar) menunggu izin untuk di-commit ke GitHub.</w:t>
+        <w:t>dua sel NO2 jarak dekat kalah (tidak nyata). Ditulis apa adanya di naskah; tanpa pemolesan.</w:t>
+      </w:r>
+    </w:p>
+    <w:p>
+      <w:pPr>
+        <w:pStyle w:val="ListBullet"/>
+        <w:spacing w:after="60"/>
+      </w:pPr>
+      <w:r>
+        <w:rPr>
+          <w:b/>
+          <w:sz w:val="21"/>
+        </w:rPr>
+        <w:t xml:space="preserve">Cakupan data: </w:t>
+      </w:r>
+      <w:r>
+        <w:rPr>
+          <w:sz w:val="21"/>
+        </w:rPr>
+        <w:t>satu kota, 5 tahun data. Klaim generalisasi harus dibatasi sepadan.</w:t>
+      </w:r>
+    </w:p>
+    <w:p>
+      <w:pPr>
+        <w:pStyle w:val="ListBullet"/>
+        <w:spacing w:after="60"/>
+      </w:pPr>
+      <w:r>
+        <w:rPr>
+          <w:b/>
+          <w:sz w:val="21"/>
+        </w:rPr>
+        <w:t xml:space="preserve">Skala RMSE: </w:t>
+      </w:r>
+      <w:r>
+        <w:rPr>
+          <w:sz w:val="21"/>
+        </w:rPr>
+        <w:t>RMSE dilaporkan di skala Box–Cox — antarmetode adil, tetapi angkanya bukan µg/m³ fisik.</w:t>
+      </w:r>
+    </w:p>
+    <w:p>
+      <w:pPr>
+        <w:pStyle w:val="ListBullet"/>
+        <w:spacing w:after="60"/>
+      </w:pPr>
+      <w:r>
+        <w:rPr>
+          <w:b/>
+          <w:sz w:val="21"/>
+        </w:rPr>
+        <w:t xml:space="preserve">Ensemble sederhana: </w:t>
+      </w:r>
+      <w:r>
+        <w:rPr>
+          <w:sz w:val="21"/>
+        </w:rPr>
+        <w:t>ensemble dilaporkan sebagai rata-rata sama berat; penimbangan bobot (weighting) belum diteliti — kerja lanjutan yang wajar.</w:t>
+      </w:r>
+    </w:p>
+    <w:p>
+      <w:pPr>
+        <w:pStyle w:val="ListBullet"/>
+        <w:spacing w:after="60"/>
+      </w:pPr>
+      <w:r>
+        <w:rPr>
+          <w:b/>
+          <w:sz w:val="21"/>
+        </w:rPr>
+        <w:t xml:space="preserve">Asumsi ketersediaan data: </w:t>
+      </w:r>
+      <w:r>
+        <w:rPr>
+          <w:sz w:val="21"/>
+        </w:rPr>
+        <w:t>ramalan tetap butuh nilai polutan terbaru sampai t−1 (perilaku identik semua lengan, termasuk metode paper); untuk jarak 30 hari praktisnya berarti data harian berjalan.</w:t>
+      </w:r>
+    </w:p>
+    <w:p>
+      <w:pPr>
+        <w:spacing w:before="280" w:after="80"/>
+      </w:pPr>
+      <w:r>
+        <w:rPr>
+          <w:b/>
+          <w:color w:val="0F172A"/>
+          <w:sz w:val="28"/>
+        </w:rPr>
+        <w:t>10. Reproduksi</w:t>
+      </w:r>
+    </w:p>
+    <w:p>
+      <w:pPr>
+        <w:pStyle w:val="ListBullet"/>
+        <w:spacing w:after="60"/>
+      </w:pPr>
+      <w:r>
+        <w:rPr>
+          <w:b/>
+          <w:sz w:val="21"/>
+        </w:rPr>
+        <w:t xml:space="preserve">Mulai dari: </w:t>
+      </w:r>
+      <w:r>
+        <w:rPr>
+          <w:sz w:val="21"/>
+        </w:rPr>
+        <w:t>notebooks/00_final_method_ens_lgbm_theta.ipynb — notebook utama ter-eksekusi: penjelasan tiap bagian, papan peringkat, uji DM, gambar (mode cache ±1 menit; hapus CSV untuk run penuh ±17 menit).</w:t>
+      </w:r>
+    </w:p>
+    <w:p>
+      <w:pPr>
+        <w:pStyle w:val="ListBullet"/>
+        <w:spacing w:after="60"/>
+      </w:pPr>
+      <w:r>
+        <w:rPr>
+          <w:b/>
+          <w:sz w:val="21"/>
+        </w:rPr>
+        <w:t xml:space="preserve">Artefak beku: </w:t>
+      </w:r>
+      <w:r>
+        <w:rPr>
+          <w:sz w:val="21"/>
+        </w:rPr>
+        <w:t>results/20_bakeoff3_predictions.csv (360 baris × 27 kolom) + 20_bakeoff3_metrics.csv + 20_bakeoff3_dm.csv; results/run_20.log; gambar di results/figures/.</w:t>
+      </w:r>
+    </w:p>
+    <w:p>
+      <w:pPr>
+        <w:pStyle w:val="ListBullet"/>
+        <w:spacing w:after="60"/>
+      </w:pPr>
+      <w:r>
+        <w:rPr>
+          <w:b/>
+          <w:sz w:val="21"/>
+        </w:rPr>
+        <w:t xml:space="preserve">Skrip pendukung: </w:t>
+      </w:r>
+      <w:r>
+        <w:rPr>
+          <w:sz w:val="21"/>
+        </w:rPr>
+        <w:t>scripts/18_fig_ensemble.py (gambar) dan skrip pembangun laporan ini; notebook/kode fase 20 semuanya sudah di-commit &amp; ter-push di GitHub (repo madajabbar/hybrid-sarima-nbeats_Anc).</w:t>
+      </w:r>
+    </w:p>
+    <w:p>
+      <w:pPr>
+        <w:pStyle w:val="ListBullet"/>
+        <w:spacing w:after="60"/>
+      </w:pPr>
+      <w:r>
+        <w:rPr>
+          <w:b/>
+          <w:sz w:val="21"/>
+        </w:rPr>
+        <w:t xml:space="preserve">Jejak audit: </w:t>
+      </w:r>
+      <w:r>
+        <w:rPr>
+          <w:sz w:val="21"/>
+        </w:rPr>
+        <w:t>semua beredar di laporan: protokol, lengan, angka per sel, dan uji statistik dapat diverifikasi ulang dari CSV.</w:t>
+      </w:r>
+    </w:p>
+    <w:p>
+      <w:pPr>
+        <w:spacing w:before="280" w:after="80"/>
+      </w:pPr>
+      <w:r>
+        <w:rPr>
+          <w:b/>
+          <w:color w:val="0F172A"/>
+          <w:sz w:val="28"/>
+        </w:rPr>
+        <w:t>11. Keputusan dan Langkah Berikutnya</w:t>
+      </w:r>
+    </w:p>
+    <w:p>
+      <w:pPr>
+        <w:pStyle w:val="ListBullet"/>
+        <w:spacing w:after="60"/>
+      </w:pPr>
+      <w:r>
+        <w:rPr>
+          <w:b/>
+          <w:sz w:val="21"/>
+        </w:rPr>
+        <w:t xml:space="preserve">Metode final: </w:t>
+      </w:r>
+      <w:r>
+        <w:rPr>
+          <w:sz w:val="21"/>
+        </w:rPr>
+        <w:t>Ensemble LGBM + Theta — terkunci 16 Oktober 2026 sebagai metode pengganti tunggal di naskah.</w:t>
       </w:r>
     </w:p>
     <w:p>
@@ -1590,7 +3533,7 @@
         <w:rPr>
           <w:sz w:val="21"/>
         </w:rPr>
-        <w:t>penulisan naskah bab metode + pembahasan, termasuk bagian pembatasan NO2 jarak dekat.</w:t>
+        <w:t>bab metode naskah ditulis dengan METODE TUNGGAL ini (tanpa cerita SARIMA/BiLSTM kecuali sebagai pembanding); bagian pembatasan memuat dua kekalahan tipis NO2 jarak dekat dan batas cakupan data.</w:t>
       </w:r>
     </w:p>
     <w:sectPr>

</xml_diff>